<commit_message>
Finalize submission-ready analysis and reports
</commit_message>
<xml_diff>
--- a/reports/public/今井达也_MLB调整决策_完整分析底稿.docx
+++ b/reports/public/今井达也_MLB调整决策_完整分析底稿.docx
@@ -107,7 +107,7 @@
           <w:color w:val="000000"/>
           <w:sz w:val="24"/>
         </w:rPr>
-        <w:t>本研究回答课程题目“今井达也在 MLB 应如何调整和发展”。研究不从 ERA 单一结果倒推能力，而把问题拆成球威、控球、球种结构、打者侧别与角色负荷五条可检验路径。主样本为今井 2026-03-29 至 2026-08-12 的 17 场 MLB 比赛、1,240 个有球种标签的 Statcast 投球和 288 个打席；比较基准为其 NPB 2018—2025 官方统计，重点使用 NPB Basement 2023—2025 高级与球种数据。</w:t>
+        <w:t>本研究回答课程题目“今井达也应该如何在 MLB 调整和发展”。分析没有从 ERA 单一结果倒推能力，而是依次检验球威、控球、球种结构、打者侧别和角色负荷五条解释路径。主样本为 2026 年 3 月 29 日至 8 月 12 日的 17 场 MLB 比赛、194 个出局数、288 个打席，以及 1,240 个带球种标签的 Statcast 投球；历史基准来自 NPB 官方 2018—2025 年统计和 NPB Basement 2023—2025 年高级、球种数据。</w:t>
       </w:r>
     </w:p>
     <w:p>
@@ -124,7 +124,7 @@
           <w:color w:val="000000"/>
           <w:sz w:val="24"/>
         </w:rPr>
-        <w:t>结论是：三振和挥空能力仍在，失败的首要来源是保送率翻倍及首球、好球区控制下降；球种层面不是“没有第三球种”，而是 2025 年成熟变速球在 MLB 的使用率从 12.7%降至 2.3%，同时速度差缩小。四缝线的伤害主要集中在左打者，滑球在两侧仍为正价值。两次牛棚登板的过程指标明显改善，但只有 23 个打席，不能推导永久转型。建议以多局牛棚为短期校准环境，重建对左打变速球，用连续 60 个打席的 Zone%、首球好球率、BB%及球种质量门槛决定何时进入 45、60、75 球的先发负荷阶梯。</w:t>
+        <w:t>结果表明，今井的三振与挥空能力仍在，首要损失来自保送率翻倍以及首球、好球区控制下降。球种层面也不是“没有第三球种”，而是 2025 年已经成熟的变速球在 MLB 的使用率从 12.7%降至 2.3%，同时与四缝线的速度差从 10.14 mph 收窄至 8.01 mph。四缝线的负面结果集中于左打者，滑球在左右两侧仍保持正价值。两次牛棚登板的过程指标明显改善，但只有 23 个打席，不能推出永久后援更优。建议以多局牛棚作为短期校准环境，逐步恢复对左打变速球，并用至少 60 个打席的进区、首球、保送和球种质量门槛决定何时进入 45、60、75 球的先发负荷阶梯。</w:t>
       </w:r>
     </w:p>
     <w:p>
@@ -138,7 +138,7 @@
           <w:color w:val="000000"/>
           <w:sz w:val="30"/>
         </w:rPr>
-        <w:t>1. 作业要求与研究问题</w:t>
+        <w:t>1. 任务理解与决策问题</w:t>
       </w:r>
     </w:p>
     <w:p>
@@ -155,7 +155,25 @@
           <w:color w:val="000000"/>
           <w:sz w:val="24"/>
         </w:rPr>
-        <w:t>课程文件给出的第二个问题是“今井达也应该如何在 MLB 调整和发展”。正式文稿要求不超过两页，第一段加粗写结论，其余证据置后；同时保留提示词、计算过程和完整底稿。本项目因此把提交物分成：两页正式决策文稿、完整底稿、可复现代码、原始快照与哈希、处理表、图表和 QA 记录。</w:t>
+        <w:t>课程要求完成一个棒球数据分析问题，并将正式文稿控制在两页以内：第一段整段加粗给出结论，其余部分提供证据与建议，同时保留数据、计算过程、提示词和完整底稿。公开仓库因此把交付物拆成两层：</w:t>
+      </w:r>
+      <w:r>
+        <w:rPr>
+          <w:rFonts w:ascii="宋体" w:hAnsi="宋体" w:eastAsia="宋体" w:cs="宋体"/>
+          <w:b w:val="0"/>
+          <w:color w:val="000000"/>
+          <w:sz w:val="23"/>
+        </w:rPr>
+        <w:t>reports/public/今井达也_MLB调整决策_正式文稿.docx</w:t>
+      </w:r>
+      <w:r>
+        <w:rPr>
+          <w:rFonts w:ascii="宋体" w:hAnsi="宋体" w:eastAsia="宋体" w:cs="宋体"/>
+          <w:b w:val="0"/>
+          <w:color w:val="000000"/>
+          <w:sz w:val="24"/>
+        </w:rPr>
+        <w:t>供直接阅读，本文档与代码、处理表、快照哈希共同承担复核职责。</w:t>
       </w:r>
     </w:p>
     <w:p>
@@ -172,7 +190,7 @@
           <w:color w:val="000000"/>
           <w:sz w:val="24"/>
         </w:rPr>
-        <w:t>决策问题不是泛泛评价球员，而是：</w:t>
+        <w:t>题目看似是评价一名投手，实际需要回答四个相互连接的决策问题：</w:t>
       </w:r>
     </w:p>
     <w:p>
@@ -210,7 +228,7 @@
           <w:color w:val="000000"/>
           <w:sz w:val="24"/>
         </w:rPr>
-        <w:t>哪些调整应按打者侧别和球数情境实施？</w:t>
+        <w:t>调整是否需要按打者侧别与球数情境区分，而不是套用统一配方？</w:t>
       </w:r>
     </w:p>
     <w:p>
@@ -229,7 +247,7 @@
           <w:color w:val="000000"/>
           <w:sz w:val="24"/>
         </w:rPr>
-        <w:t>牛棚阶段是永久角色答案，还是用于重新校准的实验环境？</w:t>
+        <w:t>牛棚阶段是长期角色答案，还是更适合用作短期校准实验？</w:t>
       </w:r>
     </w:p>
     <w:p>
@@ -248,7 +266,24 @@
           <w:color w:val="000000"/>
           <w:sz w:val="24"/>
         </w:rPr>
-        <w:t>用哪些可观测指标决定重返先发，而不是依赖一两场 ERA？</w:t>
+        <w:t>用哪些可观测指标决定重返先发，才能避免被一两场 ERA 带偏？</w:t>
+      </w:r>
+    </w:p>
+    <w:p>
+      <w:pPr>
+        <w:widowControl/>
+        <w:spacing w:after="80" w:line="360" w:lineRule="auto"/>
+        <w:ind w:firstLine="480"/>
+        <w:jc w:val="both"/>
+      </w:pPr>
+      <w:r>
+        <w:rPr>
+          <w:rFonts w:ascii="宋体" w:hAnsi="宋体" w:eastAsia="宋体" w:cs="宋体"/>
+          <w:b w:val="0"/>
+          <w:color w:val="000000"/>
+          <w:sz w:val="24"/>
+        </w:rPr>
+        <w:t>研究输出不是“预测下一场表现”，而是给出一个可更新的管理方案：什么先做、观察多久、什么条件下升级负荷，以及什么证据会推翻当前方案。</w:t>
       </w:r>
     </w:p>
     <w:p>
@@ -262,7 +297,7 @@
           <w:color w:val="000000"/>
           <w:sz w:val="30"/>
         </w:rPr>
-        <w:t>2. 预注册假设</w:t>
+        <w:t>2. 分析前假设与修改规则</w:t>
       </w:r>
     </w:p>
     <w:p>
@@ -281,7 +316,7 @@
           <w:color w:val="000000"/>
           <w:sz w:val="24"/>
         </w:rPr>
-        <w:t>H1 球威保留：K%和 Whiff%仍显示高于平均的挥空能力。</w:t>
+        <w:t>H1 球威保留：K%和 Whiff%仍能显示高于平均的挥空能力。</w:t>
       </w:r>
     </w:p>
     <w:p>
@@ -319,7 +354,7 @@
           <w:color w:val="000000"/>
           <w:sz w:val="24"/>
         </w:rPr>
-        <w:t>H3 二球种依赖：四缝线+滑球过高，且价值在打者侧别或球数上不对称。</w:t>
+        <w:t>H3 二球种依赖：四缝线与滑球占比过高，而且价值可能随打者侧别或球数改变。</w:t>
       </w:r>
     </w:p>
     <w:p>
@@ -338,7 +373,7 @@
           <w:color w:val="000000"/>
           <w:sz w:val="24"/>
         </w:rPr>
-        <w:t>H4 角色交互：缩短局数可能改善执行，但小样本只产生阶段性证据。</w:t>
+        <w:t>H4 角色交互：缩短局数可能改善执行，但两次登板只能产生阶段性证据。</w:t>
       </w:r>
     </w:p>
     <w:p>
@@ -357,7 +392,7 @@
           <w:color w:val="000000"/>
           <w:sz w:val="24"/>
         </w:rPr>
-        <w:t>H5 第三球种条件：低频球种必须结合历史成熟度、侧别和速度分层判断。</w:t>
+        <w:t>H5 第三球种条件：低频球种必须结合历史成熟度、形态与速度分层判断。</w:t>
       </w:r>
     </w:p>
     <w:p>
@@ -374,7 +409,7 @@
           <w:color w:val="000000"/>
           <w:sz w:val="24"/>
         </w:rPr>
-        <w:t>在看到分组结果前先写下这些假设，目的是降低“看到数字后编故事”的风险。分析过程中允许修改问题，但必须记录新证据和修改理由。</w:t>
+        <w:t>这些假设在分组结果产生前写入研究记录。看到新证据后允许改变问题，但必须写明“原问题—新发现—修改理由”。这样做不能消除研究者判断，却能减少看到数字后只保留顺手故事的风险。</w:t>
       </w:r>
     </w:p>
     <w:p>
@@ -388,7 +423,7 @@
           <w:color w:val="000000"/>
           <w:sz w:val="30"/>
         </w:rPr>
-        <w:t>3. 数据来源、冻结与可信度</w:t>
+        <w:t>3. 数据来源、冻结与治理</w:t>
       </w:r>
     </w:p>
     <w:p>
@@ -421,7 +456,7 @@
           <w:color w:val="000000"/>
           <w:sz w:val="24"/>
         </w:rPr>
-        <w:t>MLB StatsAPI：官方比赛日志，确定 17 场、15 次先发、64.2 局、80K、42BB，并为逐球重建提供核对基准。</w:t>
+        <w:t>MLB StatsAPI 比赛日志用于确定 17 场、15 次先发、194 个出局数、80K、42BB 和 38 个自责分，并为角色映射与逐球总量提供官方核对。</w:t>
       </w:r>
     </w:p>
     <w:p>
@@ -440,7 +475,7 @@
           <w:color w:val="000000"/>
           <w:sz w:val="24"/>
         </w:rPr>
-        <w:t>Baseball Savant Statcast：逐球球种、球数、位置、挥棒和结果。原文件 1,241 行，其中 1 行为自动坏球且无球种标签；球种分析使用其余 1,240 行。</w:t>
+        <w:t>Baseball Savant Statcast 原始 CSV 有 1,241 行。其中 1 行是无球种标签的 automatic ball；球种与过程分析使用其余 1,240 行，但比赛日志中的保送总数仍保留该事件。</w:t>
       </w:r>
     </w:p>
     <w:p>
@@ -459,7 +494,7 @@
           <w:color w:val="000000"/>
           <w:sz w:val="24"/>
         </w:rPr>
-        <w:t>Savant Expected Statistics 与 Pitch Arsenal：核对 xERA、K%、BB%、各球种官方 Run Value、wOBA/xwOBA。</w:t>
+        <w:t>Savant Expected Statistics 和 Pitch Arsenal 表用于核对 xERA、K%、BB%、各球种官方 Run Value、wOBA 与 xwOBA。</w:t>
       </w:r>
     </w:p>
     <w:p>
@@ -478,7 +513,7 @@
           <w:color w:val="000000"/>
           <w:sz w:val="24"/>
         </w:rPr>
-        <w:t>MLB.com 两篇报道：只用于确认适应背景和 7 月 31 日转牛棚的球队语境。</w:t>
+        <w:t>两篇 MLB.com 报道仅用于确认适应背景和 7 月 31 日转入牛棚的球队语境，不替代可计算数据。</w:t>
       </w:r>
     </w:p>
     <w:p>
@@ -511,7 +546,7 @@
           <w:color w:val="000000"/>
           <w:sz w:val="24"/>
         </w:rPr>
-        <w:t>NPB 官方球员页：2018—2025 传统统计；2025 为 163.2 局、178K、45BB、6HR、ERA 1.92。</w:t>
+        <w:t>NPB 官方球员页提供 2018—2025 年传统投球统计。2025 年为 163⅔ 局、178K、45BB、6HR、ERA 1.92。</w:t>
       </w:r>
     </w:p>
     <w:p>
@@ -530,7 +565,7 @@
           <w:color w:val="000000"/>
           <w:sz w:val="24"/>
         </w:rPr>
-        <w:t>NPB Basement：2023—2025 高级统计和球种数据。2025 K% 27.8%、BB% 7.0%、FIP 2.351、WAR 4.47；球种数据用于判断第三球种是否曾经成熟。</w:t>
+        <w:t>NPB Basement 提供 2023—2025 年高级指标和球种数据。2025 年 K% 27.8%、BB% 7.0%、K-BB% 20.7%、FIP 2.351、WAR 4.47；球种数据用于判断变速球是否曾经成熟。</w:t>
       </w:r>
     </w:p>
     <w:p>
@@ -544,7 +579,7 @@
           <w:color w:val="000000"/>
           <w:sz w:val="26"/>
         </w:rPr>
-        <w:t>3.3 数据治理</w:t>
+        <w:t>3.3 冻结与对账</w:t>
       </w:r>
     </w:p>
     <w:p>
@@ -554,15 +589,6 @@
         <w:ind w:firstLine="480"/>
         <w:jc w:val="both"/>
       </w:pPr>
-      <w:r>
-        <w:rPr>
-          <w:rFonts w:ascii="宋体" w:hAnsi="宋体" w:eastAsia="宋体" w:cs="宋体"/>
-          <w:b w:val="0"/>
-          <w:color w:val="000000"/>
-          <w:sz w:val="24"/>
-        </w:rPr>
-        <w:t xml:space="preserve">所有 URL、下载时间、字节数和 SHA-256 记录于 </w:t>
-      </w:r>
       <w:r>
         <w:rPr>
           <w:rFonts w:ascii="宋体" w:hAnsi="宋体" w:eastAsia="宋体" w:cs="宋体"/>
@@ -579,7 +605,25 @@
           <w:color w:val="000000"/>
           <w:sz w:val="24"/>
         </w:rPr>
-        <w:t xml:space="preserve">。原始快照不由分析脚本覆盖；处理结果写入 </w:t>
+        <w:t>和同内容 JSON 共登记 17 个来源文件，记录 URL、UTC 获取时间、字节数、行数和 SHA-256；来源名称与用途见</w:t>
+      </w:r>
+      <w:r>
+        <w:rPr>
+          <w:rFonts w:ascii="宋体" w:hAnsi="宋体" w:eastAsia="宋体" w:cs="宋体"/>
+          <w:b w:val="0"/>
+          <w:color w:val="000000"/>
+          <w:sz w:val="23"/>
+        </w:rPr>
+        <w:t>docs/research/source_register.md</w:t>
+      </w:r>
+      <w:r>
+        <w:rPr>
+          <w:rFonts w:ascii="宋体" w:hAnsi="宋体" w:eastAsia="宋体" w:cs="宋体"/>
+          <w:b w:val="0"/>
+          <w:color w:val="000000"/>
+          <w:sz w:val="24"/>
+        </w:rPr>
+        <w:t>。原始快照由联网刷新脚本建立，默认离线流水线不会覆盖。处理结果只写入</w:t>
       </w:r>
       <w:r>
         <w:rPr>
@@ -597,7 +641,7 @@
           <w:color w:val="000000"/>
           <w:sz w:val="24"/>
         </w:rPr>
-        <w:t>。StatsAPI 与 Statcast/Savant 的三振、保送、比赛数、球种球数均进行机器校验，差值为 0。</w:t>
+        <w:t>。自动校验把逐球行数、三振、保送和比赛数与冻结参照逐项对账，四项差值均为 0。这样可以把“数据来源可信”落实为具体文件和哈希，而不是一句笼统声明。</w:t>
       </w:r>
     </w:p>
     <w:p>
@@ -611,7 +655,7 @@
           <w:color w:val="000000"/>
           <w:sz w:val="30"/>
         </w:rPr>
-        <w:t>4. 指标定义与计算方法</w:t>
+        <w:t>4. 指标口径与手工复核</w:t>
       </w:r>
     </w:p>
     <w:p>
@@ -625,16 +669,1570 @@
           <w:color w:val="000000"/>
           <w:sz w:val="26"/>
         </w:rPr>
-        <w:t>4.1 结果指标</w:t>
+        <w:t>4.1 指标定义</w:t>
       </w:r>
+    </w:p>
+    <w:tbl>
+      <w:tblPr>
+        <w:tblW w:type="dxa" w:w="9071"/>
+        <w:jc w:val="left"/>
+        <w:tblLayout w:type="fixed"/>
+        <w:tblLook w:firstColumn="1" w:firstRow="1" w:lastColumn="0" w:lastRow="0" w:noHBand="0" w:noVBand="1" w:val="04A0"/>
+        <w:tblInd w:w="100" w:type="dxa"/>
+        <w:tblBorders>
+          <w:top w:val="single" w:sz="4" w:space="0" w:color="808080"/>
+          <w:left w:val="single" w:sz="4" w:space="0" w:color="808080"/>
+          <w:bottom w:val="single" w:sz="4" w:space="0" w:color="808080"/>
+          <w:right w:val="single" w:sz="4" w:space="0" w:color="808080"/>
+          <w:insideH w:val="single" w:sz="4" w:space="0" w:color="808080"/>
+          <w:insideV w:val="single" w:sz="4" w:space="0" w:color="808080"/>
+        </w:tblBorders>
+      </w:tblPr>
+      <w:tblGrid>
+        <w:gridCol w:w="1633"/>
+        <w:gridCol w:w="4535"/>
+        <w:gridCol w:w="2903"/>
+      </w:tblGrid>
+      <w:tr>
+        <w:trPr>
+          <w:cantSplit/>
+          <w:tblHeader/>
+        </w:trPr>
+        <w:tc>
+          <w:tcPr>
+            <w:tcW w:type="dxa" w:w="1633"/>
+            <w:vAlign w:val="center"/>
+            <w:tcMar>
+              <w:top w:w="60" w:type="dxa"/>
+              <w:start w:w="100" w:type="dxa"/>
+              <w:bottom w:w="60" w:type="dxa"/>
+              <w:end w:w="100" w:type="dxa"/>
+            </w:tcMar>
+            <w:shd w:val="clear" w:color="auto" w:fill="D9D9D9"/>
+          </w:tcPr>
+          <w:p>
+            <w:pPr>
+              <w:spacing w:before="0" w:after="0" w:line="288" w:lineRule="auto"/>
+              <w:jc w:val="left"/>
+            </w:pPr>
+            <w:r>
+              <w:rPr>
+                <w:rFonts w:ascii="宋体" w:hAnsi="宋体" w:eastAsia="宋体" w:cs="宋体"/>
+                <w:b/>
+                <w:color w:val="000000"/>
+                <w:sz w:val="21"/>
+              </w:rPr>
+              <w:t>指标</w:t>
+            </w:r>
+          </w:p>
+        </w:tc>
+        <w:tc>
+          <w:tcPr>
+            <w:tcW w:type="dxa" w:w="4535"/>
+            <w:vAlign w:val="center"/>
+            <w:tcMar>
+              <w:top w:w="60" w:type="dxa"/>
+              <w:start w:w="100" w:type="dxa"/>
+              <w:bottom w:w="60" w:type="dxa"/>
+              <w:end w:w="100" w:type="dxa"/>
+            </w:tcMar>
+            <w:shd w:val="clear" w:color="auto" w:fill="D9D9D9"/>
+          </w:tcPr>
+          <w:p>
+            <w:pPr>
+              <w:spacing w:before="0" w:after="0" w:line="288" w:lineRule="auto"/>
+              <w:jc w:val="left"/>
+            </w:pPr>
+            <w:r>
+              <w:rPr>
+                <w:rFonts w:ascii="宋体" w:hAnsi="宋体" w:eastAsia="宋体" w:cs="宋体"/>
+                <w:b/>
+                <w:color w:val="000000"/>
+                <w:sz w:val="21"/>
+              </w:rPr>
+              <w:t>本项目口径</w:t>
+            </w:r>
+          </w:p>
+        </w:tc>
+        <w:tc>
+          <w:tcPr>
+            <w:tcW w:type="dxa" w:w="2903"/>
+            <w:vAlign w:val="center"/>
+            <w:tcMar>
+              <w:top w:w="60" w:type="dxa"/>
+              <w:start w:w="100" w:type="dxa"/>
+              <w:bottom w:w="60" w:type="dxa"/>
+              <w:end w:w="100" w:type="dxa"/>
+            </w:tcMar>
+            <w:shd w:val="clear" w:color="auto" w:fill="D9D9D9"/>
+          </w:tcPr>
+          <w:p>
+            <w:pPr>
+              <w:spacing w:before="0" w:after="0" w:line="288" w:lineRule="auto"/>
+              <w:jc w:val="left"/>
+            </w:pPr>
+            <w:r>
+              <w:rPr>
+                <w:rFonts w:ascii="宋体" w:hAnsi="宋体" w:eastAsia="宋体" w:cs="宋体"/>
+                <w:b/>
+                <w:color w:val="000000"/>
+                <w:sz w:val="21"/>
+              </w:rPr>
+              <w:t>用途与限制</w:t>
+            </w:r>
+          </w:p>
+        </w:tc>
+      </w:tr>
+      <w:tr>
+        <w:trPr>
+          <w:cantSplit/>
+        </w:trPr>
+        <w:tc>
+          <w:tcPr>
+            <w:tcW w:type="dxa" w:w="1633"/>
+            <w:vAlign w:val="center"/>
+            <w:tcMar>
+              <w:top w:w="60" w:type="dxa"/>
+              <w:start w:w="100" w:type="dxa"/>
+              <w:bottom w:w="60" w:type="dxa"/>
+              <w:end w:w="100" w:type="dxa"/>
+            </w:tcMar>
+          </w:tcPr>
+          <w:p>
+            <w:pPr>
+              <w:spacing w:before="0" w:after="0" w:line="288" w:lineRule="auto"/>
+              <w:jc w:val="left"/>
+            </w:pPr>
+            <w:r>
+              <w:rPr>
+                <w:rFonts w:ascii="宋体" w:hAnsi="宋体" w:eastAsia="宋体" w:cs="宋体"/>
+                <w:b w:val="0"/>
+                <w:color w:val="000000"/>
+                <w:sz w:val="21"/>
+              </w:rPr>
+              <w:t>K%、BB%</w:t>
+            </w:r>
+          </w:p>
+        </w:tc>
+        <w:tc>
+          <w:tcPr>
+            <w:tcW w:type="dxa" w:w="4535"/>
+            <w:vAlign w:val="center"/>
+            <w:tcMar>
+              <w:top w:w="60" w:type="dxa"/>
+              <w:start w:w="100" w:type="dxa"/>
+              <w:bottom w:w="60" w:type="dxa"/>
+              <w:end w:w="100" w:type="dxa"/>
+            </w:tcMar>
+          </w:tcPr>
+          <w:p>
+            <w:pPr>
+              <w:spacing w:before="0" w:after="0" w:line="288" w:lineRule="auto"/>
+              <w:jc w:val="left"/>
+            </w:pPr>
+            <w:r>
+              <w:rPr>
+                <w:rFonts w:ascii="宋体" w:hAnsi="宋体" w:eastAsia="宋体" w:cs="宋体"/>
+                <w:b w:val="0"/>
+                <w:color w:val="000000"/>
+                <w:sz w:val="21"/>
+              </w:rPr>
+              <w:t>三振或保送除以打席</w:t>
+            </w:r>
+          </w:p>
+        </w:tc>
+        <w:tc>
+          <w:tcPr>
+            <w:tcW w:type="dxa" w:w="2903"/>
+            <w:vAlign w:val="center"/>
+            <w:tcMar>
+              <w:top w:w="60" w:type="dxa"/>
+              <w:start w:w="100" w:type="dxa"/>
+              <w:bottom w:w="60" w:type="dxa"/>
+              <w:end w:w="100" w:type="dxa"/>
+            </w:tcMar>
+          </w:tcPr>
+          <w:p>
+            <w:pPr>
+              <w:spacing w:before="0" w:after="0" w:line="288" w:lineRule="auto"/>
+              <w:jc w:val="left"/>
+            </w:pPr>
+            <w:r>
+              <w:rPr>
+                <w:rFonts w:ascii="宋体" w:hAnsi="宋体" w:eastAsia="宋体" w:cs="宋体"/>
+                <w:b w:val="0"/>
+                <w:color w:val="000000"/>
+                <w:sz w:val="21"/>
+              </w:rPr>
+              <w:t>结果指标；受样本与对手影响</w:t>
+            </w:r>
+          </w:p>
+        </w:tc>
+      </w:tr>
+      <w:tr>
+        <w:trPr>
+          <w:cantSplit/>
+        </w:trPr>
+        <w:tc>
+          <w:tcPr>
+            <w:tcW w:type="dxa" w:w="1633"/>
+            <w:vAlign w:val="center"/>
+            <w:tcMar>
+              <w:top w:w="60" w:type="dxa"/>
+              <w:start w:w="100" w:type="dxa"/>
+              <w:bottom w:w="60" w:type="dxa"/>
+              <w:end w:w="100" w:type="dxa"/>
+            </w:tcMar>
+          </w:tcPr>
+          <w:p>
+            <w:pPr>
+              <w:spacing w:before="0" w:after="0" w:line="288" w:lineRule="auto"/>
+              <w:jc w:val="left"/>
+            </w:pPr>
+            <w:r>
+              <w:rPr>
+                <w:rFonts w:ascii="宋体" w:hAnsi="宋体" w:eastAsia="宋体" w:cs="宋体"/>
+                <w:b w:val="0"/>
+                <w:color w:val="000000"/>
+                <w:sz w:val="21"/>
+              </w:rPr>
+              <w:t>ERA</w:t>
+            </w:r>
+          </w:p>
+        </w:tc>
+        <w:tc>
+          <w:tcPr>
+            <w:tcW w:type="dxa" w:w="4535"/>
+            <w:vAlign w:val="center"/>
+            <w:tcMar>
+              <w:top w:w="60" w:type="dxa"/>
+              <w:start w:w="100" w:type="dxa"/>
+              <w:bottom w:w="60" w:type="dxa"/>
+              <w:end w:w="100" w:type="dxa"/>
+            </w:tcMar>
+          </w:tcPr>
+          <w:p>
+            <w:pPr>
+              <w:spacing w:before="0" w:after="0" w:line="288" w:lineRule="auto"/>
+              <w:jc w:val="left"/>
+            </w:pPr>
+            <w:r>
+              <w:rPr>
+                <w:rFonts w:ascii="宋体" w:hAnsi="宋体" w:eastAsia="宋体" w:cs="宋体"/>
+                <w:b w:val="0"/>
+                <w:color w:val="000000"/>
+                <w:sz w:val="21"/>
+              </w:rPr>
+              <w:t>自责分×27/出局数</w:t>
+            </w:r>
+          </w:p>
+        </w:tc>
+        <w:tc>
+          <w:tcPr>
+            <w:tcW w:type="dxa" w:w="2903"/>
+            <w:vAlign w:val="center"/>
+            <w:tcMar>
+              <w:top w:w="60" w:type="dxa"/>
+              <w:start w:w="100" w:type="dxa"/>
+              <w:bottom w:w="60" w:type="dxa"/>
+              <w:end w:w="100" w:type="dxa"/>
+            </w:tcMar>
+          </w:tcPr>
+          <w:p>
+            <w:pPr>
+              <w:spacing w:before="0" w:after="0" w:line="288" w:lineRule="auto"/>
+              <w:jc w:val="left"/>
+            </w:pPr>
+            <w:r>
+              <w:rPr>
+                <w:rFonts w:ascii="宋体" w:hAnsi="宋体" w:eastAsia="宋体" w:cs="宋体"/>
+                <w:b w:val="0"/>
+                <w:color w:val="000000"/>
+                <w:sz w:val="21"/>
+              </w:rPr>
+              <w:t>194 个出局数按 64⅔ 局处理，不能把“64.2”当十进制</w:t>
+            </w:r>
+          </w:p>
+        </w:tc>
+      </w:tr>
+      <w:tr>
+        <w:trPr>
+          <w:cantSplit/>
+        </w:trPr>
+        <w:tc>
+          <w:tcPr>
+            <w:tcW w:type="dxa" w:w="1633"/>
+            <w:vAlign w:val="center"/>
+            <w:tcMar>
+              <w:top w:w="60" w:type="dxa"/>
+              <w:start w:w="100" w:type="dxa"/>
+              <w:bottom w:w="60" w:type="dxa"/>
+              <w:end w:w="100" w:type="dxa"/>
+            </w:tcMar>
+          </w:tcPr>
+          <w:p>
+            <w:pPr>
+              <w:spacing w:before="0" w:after="0" w:line="288" w:lineRule="auto"/>
+              <w:jc w:val="left"/>
+            </w:pPr>
+            <w:r>
+              <w:rPr>
+                <w:rFonts w:ascii="宋体" w:hAnsi="宋体" w:eastAsia="宋体" w:cs="宋体"/>
+                <w:b w:val="0"/>
+                <w:color w:val="000000"/>
+                <w:sz w:val="21"/>
+              </w:rPr>
+              <w:t>Zone%</w:t>
+            </w:r>
+          </w:p>
+        </w:tc>
+        <w:tc>
+          <w:tcPr>
+            <w:tcW w:type="dxa" w:w="4535"/>
+            <w:vAlign w:val="center"/>
+            <w:tcMar>
+              <w:top w:w="60" w:type="dxa"/>
+              <w:start w:w="100" w:type="dxa"/>
+              <w:bottom w:w="60" w:type="dxa"/>
+              <w:end w:w="100" w:type="dxa"/>
+            </w:tcMar>
+          </w:tcPr>
+          <w:p>
+            <w:pPr>
+              <w:spacing w:before="0" w:after="0" w:line="288" w:lineRule="auto"/>
+              <w:jc w:val="left"/>
+            </w:pPr>
+            <w:r>
+              <w:rPr>
+                <w:rFonts w:ascii="宋体" w:hAnsi="宋体" w:eastAsia="宋体" w:cs="宋体"/>
+                <w:b w:val="0"/>
+                <w:color w:val="000000"/>
+                <w:sz w:val="21"/>
+              </w:rPr>
+              <w:t xml:space="preserve">Statcast </w:t>
+            </w:r>
+            <w:r>
+              <w:rPr>
+                <w:rFonts w:ascii="宋体" w:hAnsi="宋体" w:eastAsia="宋体" w:cs="宋体"/>
+                <w:b w:val="0"/>
+                <w:color w:val="000000"/>
+                <w:sz w:val="20"/>
+              </w:rPr>
+              <w:t>zone</w:t>
+            </w:r>
+            <w:r>
+              <w:rPr>
+                <w:rFonts w:ascii="宋体" w:hAnsi="宋体" w:eastAsia="宋体" w:cs="宋体"/>
+                <w:b w:val="0"/>
+                <w:color w:val="000000"/>
+                <w:sz w:val="21"/>
+              </w:rPr>
+              <w:t xml:space="preserve"> 为 1—9 的投球数/有记录投球数</w:t>
+            </w:r>
+          </w:p>
+        </w:tc>
+        <w:tc>
+          <w:tcPr>
+            <w:tcW w:type="dxa" w:w="2903"/>
+            <w:vAlign w:val="center"/>
+            <w:tcMar>
+              <w:top w:w="60" w:type="dxa"/>
+              <w:start w:w="100" w:type="dxa"/>
+              <w:bottom w:w="60" w:type="dxa"/>
+              <w:end w:w="100" w:type="dxa"/>
+            </w:tcMar>
+          </w:tcPr>
+          <w:p>
+            <w:pPr>
+              <w:spacing w:before="0" w:after="0" w:line="288" w:lineRule="auto"/>
+              <w:jc w:val="left"/>
+            </w:pPr>
+            <w:r>
+              <w:rPr>
+                <w:rFonts w:ascii="宋体" w:hAnsi="宋体" w:eastAsia="宋体" w:cs="宋体"/>
+                <w:b w:val="0"/>
+                <w:color w:val="000000"/>
+                <w:sz w:val="21"/>
+              </w:rPr>
+              <w:t>描述进区，不等同于裁判实际判罚</w:t>
+            </w:r>
+          </w:p>
+        </w:tc>
+      </w:tr>
+      <w:tr>
+        <w:trPr>
+          <w:cantSplit/>
+        </w:trPr>
+        <w:tc>
+          <w:tcPr>
+            <w:tcW w:type="dxa" w:w="1633"/>
+            <w:vAlign w:val="center"/>
+            <w:tcMar>
+              <w:top w:w="60" w:type="dxa"/>
+              <w:start w:w="100" w:type="dxa"/>
+              <w:bottom w:w="60" w:type="dxa"/>
+              <w:end w:w="100" w:type="dxa"/>
+            </w:tcMar>
+          </w:tcPr>
+          <w:p>
+            <w:pPr>
+              <w:spacing w:before="0" w:after="0" w:line="288" w:lineRule="auto"/>
+              <w:jc w:val="left"/>
+            </w:pPr>
+            <w:r>
+              <w:rPr>
+                <w:rFonts w:ascii="宋体" w:hAnsi="宋体" w:eastAsia="宋体" w:cs="宋体"/>
+                <w:b w:val="0"/>
+                <w:color w:val="000000"/>
+                <w:sz w:val="21"/>
+              </w:rPr>
+              <w:t>首球好球率</w:t>
+            </w:r>
+          </w:p>
+        </w:tc>
+        <w:tc>
+          <w:tcPr>
+            <w:tcW w:type="dxa" w:w="4535"/>
+            <w:vAlign w:val="center"/>
+            <w:tcMar>
+              <w:top w:w="60" w:type="dxa"/>
+              <w:start w:w="100" w:type="dxa"/>
+              <w:bottom w:w="60" w:type="dxa"/>
+              <w:end w:w="100" w:type="dxa"/>
+            </w:tcMar>
+          </w:tcPr>
+          <w:p>
+            <w:pPr>
+              <w:spacing w:before="0" w:after="0" w:line="288" w:lineRule="auto"/>
+              <w:jc w:val="left"/>
+            </w:pPr>
+            <w:r>
+              <w:rPr>
+                <w:rFonts w:ascii="宋体" w:hAnsi="宋体" w:eastAsia="宋体" w:cs="宋体"/>
+                <w:b w:val="0"/>
+                <w:color w:val="000000"/>
+                <w:sz w:val="21"/>
+              </w:rPr>
+              <w:t>每个打席第一球不是 ball、blocked ball、hit by pitch 等坏球事件的比例</w:t>
+            </w:r>
+          </w:p>
+        </w:tc>
+        <w:tc>
+          <w:tcPr>
+            <w:tcW w:type="dxa" w:w="2903"/>
+            <w:vAlign w:val="center"/>
+            <w:tcMar>
+              <w:top w:w="60" w:type="dxa"/>
+              <w:start w:w="100" w:type="dxa"/>
+              <w:bottom w:w="60" w:type="dxa"/>
+              <w:end w:w="100" w:type="dxa"/>
+            </w:tcMar>
+          </w:tcPr>
+          <w:p>
+            <w:pPr>
+              <w:spacing w:before="0" w:after="0" w:line="288" w:lineRule="auto"/>
+              <w:jc w:val="left"/>
+            </w:pPr>
+            <w:r>
+              <w:rPr>
+                <w:rFonts w:ascii="宋体" w:hAnsi="宋体" w:eastAsia="宋体" w:cs="宋体"/>
+                <w:b w:val="0"/>
+                <w:color w:val="000000"/>
+                <w:sz w:val="21"/>
+              </w:rPr>
+              <w:t>衡量抢 0—1 的执行，不只统计 called strike</w:t>
+            </w:r>
+          </w:p>
+        </w:tc>
+      </w:tr>
+      <w:tr>
+        <w:trPr>
+          <w:cantSplit/>
+        </w:trPr>
+        <w:tc>
+          <w:tcPr>
+            <w:tcW w:type="dxa" w:w="1633"/>
+            <w:vAlign w:val="center"/>
+            <w:tcMar>
+              <w:top w:w="60" w:type="dxa"/>
+              <w:start w:w="100" w:type="dxa"/>
+              <w:bottom w:w="60" w:type="dxa"/>
+              <w:end w:w="100" w:type="dxa"/>
+            </w:tcMar>
+          </w:tcPr>
+          <w:p>
+            <w:pPr>
+              <w:spacing w:before="0" w:after="0" w:line="288" w:lineRule="auto"/>
+              <w:jc w:val="left"/>
+            </w:pPr>
+            <w:r>
+              <w:rPr>
+                <w:rFonts w:ascii="宋体" w:hAnsi="宋体" w:eastAsia="宋体" w:cs="宋体"/>
+                <w:b w:val="0"/>
+                <w:color w:val="000000"/>
+                <w:sz w:val="21"/>
+              </w:rPr>
+              <w:t>Whiff%</w:t>
+            </w:r>
+          </w:p>
+        </w:tc>
+        <w:tc>
+          <w:tcPr>
+            <w:tcW w:type="dxa" w:w="4535"/>
+            <w:vAlign w:val="center"/>
+            <w:tcMar>
+              <w:top w:w="60" w:type="dxa"/>
+              <w:start w:w="100" w:type="dxa"/>
+              <w:bottom w:w="60" w:type="dxa"/>
+              <w:end w:w="100" w:type="dxa"/>
+            </w:tcMar>
+          </w:tcPr>
+          <w:p>
+            <w:pPr>
+              <w:spacing w:before="0" w:after="0" w:line="288" w:lineRule="auto"/>
+              <w:jc w:val="left"/>
+            </w:pPr>
+            <w:r>
+              <w:rPr>
+                <w:rFonts w:ascii="宋体" w:hAnsi="宋体" w:eastAsia="宋体" w:cs="宋体"/>
+                <w:b w:val="0"/>
+                <w:color w:val="000000"/>
+                <w:sz w:val="21"/>
+              </w:rPr>
+              <w:t>swinging strike、blocked swinging strike、foul tip 等挥空事件/全部挥棒</w:t>
+            </w:r>
+          </w:p>
+        </w:tc>
+        <w:tc>
+          <w:tcPr>
+            <w:tcW w:type="dxa" w:w="2903"/>
+            <w:vAlign w:val="center"/>
+            <w:tcMar>
+              <w:top w:w="60" w:type="dxa"/>
+              <w:start w:w="100" w:type="dxa"/>
+              <w:bottom w:w="60" w:type="dxa"/>
+              <w:end w:w="100" w:type="dxa"/>
+            </w:tcMar>
+          </w:tcPr>
+          <w:p>
+            <w:pPr>
+              <w:spacing w:before="0" w:after="0" w:line="288" w:lineRule="auto"/>
+              <w:jc w:val="left"/>
+            </w:pPr>
+            <w:r>
+              <w:rPr>
+                <w:rFonts w:ascii="宋体" w:hAnsi="宋体" w:eastAsia="宋体" w:cs="宋体"/>
+                <w:b w:val="0"/>
+                <w:color w:val="000000"/>
+                <w:sz w:val="21"/>
+              </w:rPr>
+              <w:t>分母是挥棒，不是全部投球</w:t>
+            </w:r>
+          </w:p>
+        </w:tc>
+      </w:tr>
+      <w:tr>
+        <w:trPr>
+          <w:cantSplit/>
+        </w:trPr>
+        <w:tc>
+          <w:tcPr>
+            <w:tcW w:type="dxa" w:w="1633"/>
+            <w:vAlign w:val="center"/>
+            <w:tcMar>
+              <w:top w:w="60" w:type="dxa"/>
+              <w:start w:w="100" w:type="dxa"/>
+              <w:bottom w:w="60" w:type="dxa"/>
+              <w:end w:w="100" w:type="dxa"/>
+            </w:tcMar>
+          </w:tcPr>
+          <w:p>
+            <w:pPr>
+              <w:spacing w:before="0" w:after="0" w:line="288" w:lineRule="auto"/>
+              <w:jc w:val="left"/>
+            </w:pPr>
+            <w:r>
+              <w:rPr>
+                <w:rFonts w:ascii="宋体" w:hAnsi="宋体" w:eastAsia="宋体" w:cs="宋体"/>
+                <w:b w:val="0"/>
+                <w:color w:val="000000"/>
+                <w:sz w:val="21"/>
+              </w:rPr>
+              <w:t>Chase%</w:t>
+            </w:r>
+          </w:p>
+        </w:tc>
+        <w:tc>
+          <w:tcPr>
+            <w:tcW w:type="dxa" w:w="4535"/>
+            <w:vAlign w:val="center"/>
+            <w:tcMar>
+              <w:top w:w="60" w:type="dxa"/>
+              <w:start w:w="100" w:type="dxa"/>
+              <w:bottom w:w="60" w:type="dxa"/>
+              <w:end w:w="100" w:type="dxa"/>
+            </w:tcMar>
+          </w:tcPr>
+          <w:p>
+            <w:pPr>
+              <w:spacing w:before="0" w:after="0" w:line="288" w:lineRule="auto"/>
+              <w:jc w:val="left"/>
+            </w:pPr>
+            <w:r>
+              <w:rPr>
+                <w:rFonts w:ascii="宋体" w:hAnsi="宋体" w:eastAsia="宋体" w:cs="宋体"/>
+                <w:b w:val="0"/>
+                <w:color w:val="000000"/>
+                <w:sz w:val="21"/>
+              </w:rPr>
+              <w:t>区外投球上的挥棒/区外投球</w:t>
+            </w:r>
+          </w:p>
+        </w:tc>
+        <w:tc>
+          <w:tcPr>
+            <w:tcW w:type="dxa" w:w="2903"/>
+            <w:vAlign w:val="center"/>
+            <w:tcMar>
+              <w:top w:w="60" w:type="dxa"/>
+              <w:start w:w="100" w:type="dxa"/>
+              <w:bottom w:w="60" w:type="dxa"/>
+              <w:end w:w="100" w:type="dxa"/>
+            </w:tcMar>
+          </w:tcPr>
+          <w:p>
+            <w:pPr>
+              <w:spacing w:before="0" w:after="0" w:line="288" w:lineRule="auto"/>
+              <w:jc w:val="left"/>
+            </w:pPr>
+            <w:r>
+              <w:rPr>
+                <w:rFonts w:ascii="宋体" w:hAnsi="宋体" w:eastAsia="宋体" w:cs="宋体"/>
+                <w:b w:val="0"/>
+                <w:color w:val="000000"/>
+                <w:sz w:val="21"/>
+              </w:rPr>
+              <w:t>依赖 Statcast 区域编码</w:t>
+            </w:r>
+          </w:p>
+        </w:tc>
+      </w:tr>
+      <w:tr>
+        <w:trPr>
+          <w:cantSplit/>
+        </w:trPr>
+        <w:tc>
+          <w:tcPr>
+            <w:tcW w:type="dxa" w:w="1633"/>
+            <w:vAlign w:val="center"/>
+            <w:tcMar>
+              <w:top w:w="60" w:type="dxa"/>
+              <w:start w:w="100" w:type="dxa"/>
+              <w:bottom w:w="60" w:type="dxa"/>
+              <w:end w:w="100" w:type="dxa"/>
+            </w:tcMar>
+          </w:tcPr>
+          <w:p>
+            <w:pPr>
+              <w:spacing w:before="0" w:after="0" w:line="288" w:lineRule="auto"/>
+              <w:jc w:val="left"/>
+            </w:pPr>
+            <w:r>
+              <w:rPr>
+                <w:rFonts w:ascii="宋体" w:hAnsi="宋体" w:eastAsia="宋体" w:cs="宋体"/>
+                <w:b w:val="0"/>
+                <w:color w:val="000000"/>
+                <w:sz w:val="21"/>
+              </w:rPr>
+              <w:t>RV/100</w:t>
+            </w:r>
+          </w:p>
+        </w:tc>
+        <w:tc>
+          <w:tcPr>
+            <w:tcW w:type="dxa" w:w="4535"/>
+            <w:vAlign w:val="center"/>
+            <w:tcMar>
+              <w:top w:w="60" w:type="dxa"/>
+              <w:start w:w="100" w:type="dxa"/>
+              <w:bottom w:w="60" w:type="dxa"/>
+              <w:end w:w="100" w:type="dxa"/>
+            </w:tcMar>
+          </w:tcPr>
+          <w:p>
+            <w:pPr>
+              <w:spacing w:before="0" w:after="0" w:line="288" w:lineRule="auto"/>
+              <w:jc w:val="left"/>
+            </w:pPr>
+            <w:r>
+              <w:rPr>
+                <w:rFonts w:ascii="宋体" w:hAnsi="宋体" w:eastAsia="宋体" w:cs="宋体"/>
+                <w:b w:val="0"/>
+                <w:color w:val="000000"/>
+                <w:sz w:val="21"/>
+              </w:rPr>
+              <w:t>投手视角 Run Value 合计/球数×100</w:t>
+            </w:r>
+          </w:p>
+        </w:tc>
+        <w:tc>
+          <w:tcPr>
+            <w:tcW w:type="dxa" w:w="2903"/>
+            <w:vAlign w:val="center"/>
+            <w:tcMar>
+              <w:top w:w="60" w:type="dxa"/>
+              <w:start w:w="100" w:type="dxa"/>
+              <w:bottom w:w="60" w:type="dxa"/>
+              <w:end w:w="100" w:type="dxa"/>
+            </w:tcMar>
+          </w:tcPr>
+          <w:p>
+            <w:pPr>
+              <w:spacing w:before="0" w:after="0" w:line="288" w:lineRule="auto"/>
+              <w:jc w:val="left"/>
+            </w:pPr>
+            <w:r>
+              <w:rPr>
+                <w:rFonts w:ascii="宋体" w:hAnsi="宋体" w:eastAsia="宋体" w:cs="宋体"/>
+                <w:b w:val="0"/>
+                <w:color w:val="000000"/>
+                <w:sz w:val="21"/>
+              </w:rPr>
+              <w:t>本文正值对投手有利；小分组不作能力定论</w:t>
+            </w:r>
+          </w:p>
+        </w:tc>
+      </w:tr>
+    </w:tbl>
+    <w:p>
+      <w:pPr>
+        <w:spacing w:before="0" w:after="40"/>
+      </w:pPr>
     </w:p>
     <w:p>
       <w:pPr>
-        <w:numPr>
-          <w:ilvl w:val="0"/>
-          <w:numId w:val="14"/>
-        </w:numPr>
+        <w:pStyle w:val="Heading2"/>
+      </w:pPr>
+      <w:r>
+        <w:rPr>
+          <w:rFonts w:ascii="黑体" w:hAnsi="黑体" w:eastAsia="黑体" w:cs="黑体"/>
+          <w:b/>
+          <w:color w:val="000000"/>
+          <w:sz w:val="26"/>
+        </w:rPr>
+        <w:t>4.2 核心数字的分子与分母</w:t>
+      </w:r>
+    </w:p>
+    <w:tbl>
+      <w:tblPr>
+        <w:tblW w:type="dxa" w:w="9071"/>
+        <w:jc w:val="left"/>
+        <w:tblLayout w:type="fixed"/>
+        <w:tblLook w:firstColumn="1" w:firstRow="1" w:lastColumn="0" w:lastRow="0" w:noHBand="0" w:noVBand="1" w:val="04A0"/>
+        <w:tblInd w:w="100" w:type="dxa"/>
+        <w:tblBorders>
+          <w:top w:val="single" w:sz="4" w:space="0" w:color="808080"/>
+          <w:left w:val="single" w:sz="4" w:space="0" w:color="808080"/>
+          <w:bottom w:val="single" w:sz="4" w:space="0" w:color="808080"/>
+          <w:right w:val="single" w:sz="4" w:space="0" w:color="808080"/>
+          <w:insideH w:val="single" w:sz="4" w:space="0" w:color="808080"/>
+          <w:insideV w:val="single" w:sz="4" w:space="0" w:color="808080"/>
+        </w:tblBorders>
+      </w:tblPr>
+      <w:tblGrid>
+        <w:gridCol w:w="1633"/>
+        <w:gridCol w:w="4535"/>
+        <w:gridCol w:w="2903"/>
+      </w:tblGrid>
+      <w:tr>
+        <w:trPr>
+          <w:cantSplit/>
+          <w:tblHeader/>
+        </w:trPr>
+        <w:tc>
+          <w:tcPr>
+            <w:tcW w:type="dxa" w:w="1633"/>
+            <w:vAlign w:val="center"/>
+            <w:tcMar>
+              <w:top w:w="60" w:type="dxa"/>
+              <w:start w:w="100" w:type="dxa"/>
+              <w:bottom w:w="60" w:type="dxa"/>
+              <w:end w:w="100" w:type="dxa"/>
+            </w:tcMar>
+            <w:shd w:val="clear" w:color="auto" w:fill="D9D9D9"/>
+          </w:tcPr>
+          <w:p>
+            <w:pPr>
+              <w:spacing w:before="0" w:after="0" w:line="288" w:lineRule="auto"/>
+              <w:jc w:val="left"/>
+            </w:pPr>
+            <w:r>
+              <w:rPr>
+                <w:rFonts w:ascii="宋体" w:hAnsi="宋体" w:eastAsia="宋体" w:cs="宋体"/>
+                <w:b/>
+                <w:color w:val="000000"/>
+                <w:sz w:val="21"/>
+              </w:rPr>
+              <w:t>计算</w:t>
+            </w:r>
+          </w:p>
+        </w:tc>
+        <w:tc>
+          <w:tcPr>
+            <w:tcW w:type="dxa" w:w="4535"/>
+            <w:vAlign w:val="center"/>
+            <w:tcMar>
+              <w:top w:w="60" w:type="dxa"/>
+              <w:start w:w="100" w:type="dxa"/>
+              <w:bottom w:w="60" w:type="dxa"/>
+              <w:end w:w="100" w:type="dxa"/>
+            </w:tcMar>
+            <w:shd w:val="clear" w:color="auto" w:fill="D9D9D9"/>
+          </w:tcPr>
+          <w:p>
+            <w:pPr>
+              <w:spacing w:before="0" w:after="0" w:line="288" w:lineRule="auto"/>
+              <w:jc w:val="left"/>
+            </w:pPr>
+            <w:r>
+              <w:rPr>
+                <w:rFonts w:ascii="宋体" w:hAnsi="宋体" w:eastAsia="宋体" w:cs="宋体"/>
+                <w:b/>
+                <w:color w:val="000000"/>
+                <w:sz w:val="21"/>
+              </w:rPr>
+              <w:t>代入</w:t>
+            </w:r>
+          </w:p>
+        </w:tc>
+        <w:tc>
+          <w:tcPr>
+            <w:tcW w:type="dxa" w:w="2903"/>
+            <w:vAlign w:val="center"/>
+            <w:tcMar>
+              <w:top w:w="60" w:type="dxa"/>
+              <w:start w:w="100" w:type="dxa"/>
+              <w:bottom w:w="60" w:type="dxa"/>
+              <w:end w:w="100" w:type="dxa"/>
+            </w:tcMar>
+            <w:shd w:val="clear" w:color="auto" w:fill="D9D9D9"/>
+          </w:tcPr>
+          <w:p>
+            <w:pPr>
+              <w:spacing w:before="0" w:after="0" w:line="288" w:lineRule="auto"/>
+              <w:jc w:val="left"/>
+            </w:pPr>
+            <w:r>
+              <w:rPr>
+                <w:rFonts w:ascii="宋体" w:hAnsi="宋体" w:eastAsia="宋体" w:cs="宋体"/>
+                <w:b/>
+                <w:color w:val="000000"/>
+                <w:sz w:val="21"/>
+              </w:rPr>
+              <w:t>结果</w:t>
+            </w:r>
+          </w:p>
+        </w:tc>
+      </w:tr>
+      <w:tr>
+        <w:trPr>
+          <w:cantSplit/>
+        </w:trPr>
+        <w:tc>
+          <w:tcPr>
+            <w:tcW w:type="dxa" w:w="1633"/>
+            <w:vAlign w:val="center"/>
+            <w:tcMar>
+              <w:top w:w="60" w:type="dxa"/>
+              <w:start w:w="100" w:type="dxa"/>
+              <w:bottom w:w="60" w:type="dxa"/>
+              <w:end w:w="100" w:type="dxa"/>
+            </w:tcMar>
+          </w:tcPr>
+          <w:p>
+            <w:pPr>
+              <w:spacing w:before="0" w:after="0" w:line="288" w:lineRule="auto"/>
+              <w:jc w:val="left"/>
+            </w:pPr>
+            <w:r>
+              <w:rPr>
+                <w:rFonts w:ascii="宋体" w:hAnsi="宋体" w:eastAsia="宋体" w:cs="宋体"/>
+                <w:b w:val="0"/>
+                <w:color w:val="000000"/>
+                <w:sz w:val="21"/>
+              </w:rPr>
+              <w:t>ERA</w:t>
+            </w:r>
+          </w:p>
+        </w:tc>
+        <w:tc>
+          <w:tcPr>
+            <w:tcW w:type="dxa" w:w="4535"/>
+            <w:vAlign w:val="center"/>
+            <w:tcMar>
+              <w:top w:w="60" w:type="dxa"/>
+              <w:start w:w="100" w:type="dxa"/>
+              <w:bottom w:w="60" w:type="dxa"/>
+              <w:end w:w="100" w:type="dxa"/>
+            </w:tcMar>
+          </w:tcPr>
+          <w:p>
+            <w:pPr>
+              <w:spacing w:before="0" w:after="0" w:line="288" w:lineRule="auto"/>
+              <w:jc w:val="left"/>
+            </w:pPr>
+            <w:r>
+              <w:rPr>
+                <w:rFonts w:ascii="宋体" w:hAnsi="宋体" w:eastAsia="宋体" w:cs="宋体"/>
+                <w:b w:val="0"/>
+                <w:color w:val="000000"/>
+                <w:sz w:val="21"/>
+              </w:rPr>
+              <w:t>38×27/194</w:t>
+            </w:r>
+          </w:p>
+        </w:tc>
+        <w:tc>
+          <w:tcPr>
+            <w:tcW w:type="dxa" w:w="2903"/>
+            <w:vAlign w:val="center"/>
+            <w:tcMar>
+              <w:top w:w="60" w:type="dxa"/>
+              <w:start w:w="100" w:type="dxa"/>
+              <w:bottom w:w="60" w:type="dxa"/>
+              <w:end w:w="100" w:type="dxa"/>
+            </w:tcMar>
+          </w:tcPr>
+          <w:p>
+            <w:pPr>
+              <w:spacing w:before="0" w:after="0" w:line="288" w:lineRule="auto"/>
+              <w:jc w:val="left"/>
+            </w:pPr>
+            <w:r>
+              <w:rPr>
+                <w:rFonts w:ascii="宋体" w:hAnsi="宋体" w:eastAsia="宋体" w:cs="宋体"/>
+                <w:b w:val="0"/>
+                <w:color w:val="000000"/>
+                <w:sz w:val="21"/>
+              </w:rPr>
+              <w:t>5.29</w:t>
+            </w:r>
+          </w:p>
+        </w:tc>
+      </w:tr>
+      <w:tr>
+        <w:trPr>
+          <w:cantSplit/>
+        </w:trPr>
+        <w:tc>
+          <w:tcPr>
+            <w:tcW w:type="dxa" w:w="1633"/>
+            <w:vAlign w:val="center"/>
+            <w:tcMar>
+              <w:top w:w="60" w:type="dxa"/>
+              <w:start w:w="100" w:type="dxa"/>
+              <w:bottom w:w="60" w:type="dxa"/>
+              <w:end w:w="100" w:type="dxa"/>
+            </w:tcMar>
+          </w:tcPr>
+          <w:p>
+            <w:pPr>
+              <w:spacing w:before="0" w:after="0" w:line="288" w:lineRule="auto"/>
+              <w:jc w:val="left"/>
+            </w:pPr>
+            <w:r>
+              <w:rPr>
+                <w:rFonts w:ascii="宋体" w:hAnsi="宋体" w:eastAsia="宋体" w:cs="宋体"/>
+                <w:b w:val="0"/>
+                <w:color w:val="000000"/>
+                <w:sz w:val="21"/>
+              </w:rPr>
+              <w:t>K%</w:t>
+            </w:r>
+          </w:p>
+        </w:tc>
+        <w:tc>
+          <w:tcPr>
+            <w:tcW w:type="dxa" w:w="4535"/>
+            <w:vAlign w:val="center"/>
+            <w:tcMar>
+              <w:top w:w="60" w:type="dxa"/>
+              <w:start w:w="100" w:type="dxa"/>
+              <w:bottom w:w="60" w:type="dxa"/>
+              <w:end w:w="100" w:type="dxa"/>
+            </w:tcMar>
+          </w:tcPr>
+          <w:p>
+            <w:pPr>
+              <w:spacing w:before="0" w:after="0" w:line="288" w:lineRule="auto"/>
+              <w:jc w:val="left"/>
+            </w:pPr>
+            <w:r>
+              <w:rPr>
+                <w:rFonts w:ascii="宋体" w:hAnsi="宋体" w:eastAsia="宋体" w:cs="宋体"/>
+                <w:b w:val="0"/>
+                <w:color w:val="000000"/>
+                <w:sz w:val="21"/>
+              </w:rPr>
+              <w:t>80/288</w:t>
+            </w:r>
+          </w:p>
+        </w:tc>
+        <w:tc>
+          <w:tcPr>
+            <w:tcW w:type="dxa" w:w="2903"/>
+            <w:vAlign w:val="center"/>
+            <w:tcMar>
+              <w:top w:w="60" w:type="dxa"/>
+              <w:start w:w="100" w:type="dxa"/>
+              <w:bottom w:w="60" w:type="dxa"/>
+              <w:end w:w="100" w:type="dxa"/>
+            </w:tcMar>
+          </w:tcPr>
+          <w:p>
+            <w:pPr>
+              <w:spacing w:before="0" w:after="0" w:line="288" w:lineRule="auto"/>
+              <w:jc w:val="left"/>
+            </w:pPr>
+            <w:r>
+              <w:rPr>
+                <w:rFonts w:ascii="宋体" w:hAnsi="宋体" w:eastAsia="宋体" w:cs="宋体"/>
+                <w:b w:val="0"/>
+                <w:color w:val="000000"/>
+                <w:sz w:val="21"/>
+              </w:rPr>
+              <w:t>27.8%</w:t>
+            </w:r>
+          </w:p>
+        </w:tc>
+      </w:tr>
+      <w:tr>
+        <w:trPr>
+          <w:cantSplit/>
+        </w:trPr>
+        <w:tc>
+          <w:tcPr>
+            <w:tcW w:type="dxa" w:w="1633"/>
+            <w:vAlign w:val="center"/>
+            <w:tcMar>
+              <w:top w:w="60" w:type="dxa"/>
+              <w:start w:w="100" w:type="dxa"/>
+              <w:bottom w:w="60" w:type="dxa"/>
+              <w:end w:w="100" w:type="dxa"/>
+            </w:tcMar>
+          </w:tcPr>
+          <w:p>
+            <w:pPr>
+              <w:spacing w:before="0" w:after="0" w:line="288" w:lineRule="auto"/>
+              <w:jc w:val="left"/>
+            </w:pPr>
+            <w:r>
+              <w:rPr>
+                <w:rFonts w:ascii="宋体" w:hAnsi="宋体" w:eastAsia="宋体" w:cs="宋体"/>
+                <w:b w:val="0"/>
+                <w:color w:val="000000"/>
+                <w:sz w:val="21"/>
+              </w:rPr>
+              <w:t>BB%</w:t>
+            </w:r>
+          </w:p>
+        </w:tc>
+        <w:tc>
+          <w:tcPr>
+            <w:tcW w:type="dxa" w:w="4535"/>
+            <w:vAlign w:val="center"/>
+            <w:tcMar>
+              <w:top w:w="60" w:type="dxa"/>
+              <w:start w:w="100" w:type="dxa"/>
+              <w:bottom w:w="60" w:type="dxa"/>
+              <w:end w:w="100" w:type="dxa"/>
+            </w:tcMar>
+          </w:tcPr>
+          <w:p>
+            <w:pPr>
+              <w:spacing w:before="0" w:after="0" w:line="288" w:lineRule="auto"/>
+              <w:jc w:val="left"/>
+            </w:pPr>
+            <w:r>
+              <w:rPr>
+                <w:rFonts w:ascii="宋体" w:hAnsi="宋体" w:eastAsia="宋体" w:cs="宋体"/>
+                <w:b w:val="0"/>
+                <w:color w:val="000000"/>
+                <w:sz w:val="21"/>
+              </w:rPr>
+              <w:t>42/288</w:t>
+            </w:r>
+          </w:p>
+        </w:tc>
+        <w:tc>
+          <w:tcPr>
+            <w:tcW w:type="dxa" w:w="2903"/>
+            <w:vAlign w:val="center"/>
+            <w:tcMar>
+              <w:top w:w="60" w:type="dxa"/>
+              <w:start w:w="100" w:type="dxa"/>
+              <w:bottom w:w="60" w:type="dxa"/>
+              <w:end w:w="100" w:type="dxa"/>
+            </w:tcMar>
+          </w:tcPr>
+          <w:p>
+            <w:pPr>
+              <w:spacing w:before="0" w:after="0" w:line="288" w:lineRule="auto"/>
+              <w:jc w:val="left"/>
+            </w:pPr>
+            <w:r>
+              <w:rPr>
+                <w:rFonts w:ascii="宋体" w:hAnsi="宋体" w:eastAsia="宋体" w:cs="宋体"/>
+                <w:b w:val="0"/>
+                <w:color w:val="000000"/>
+                <w:sz w:val="21"/>
+              </w:rPr>
+              <w:t>14.6%</w:t>
+            </w:r>
+          </w:p>
+        </w:tc>
+      </w:tr>
+      <w:tr>
+        <w:trPr>
+          <w:cantSplit/>
+        </w:trPr>
+        <w:tc>
+          <w:tcPr>
+            <w:tcW w:type="dxa" w:w="1633"/>
+            <w:vAlign w:val="center"/>
+            <w:tcMar>
+              <w:top w:w="60" w:type="dxa"/>
+              <w:start w:w="100" w:type="dxa"/>
+              <w:bottom w:w="60" w:type="dxa"/>
+              <w:end w:w="100" w:type="dxa"/>
+            </w:tcMar>
+          </w:tcPr>
+          <w:p>
+            <w:pPr>
+              <w:spacing w:before="0" w:after="0" w:line="288" w:lineRule="auto"/>
+              <w:jc w:val="left"/>
+            </w:pPr>
+            <w:r>
+              <w:rPr>
+                <w:rFonts w:ascii="宋体" w:hAnsi="宋体" w:eastAsia="宋体" w:cs="宋体"/>
+                <w:b w:val="0"/>
+                <w:color w:val="000000"/>
+                <w:sz w:val="21"/>
+              </w:rPr>
+              <w:t>K-BB%</w:t>
+            </w:r>
+          </w:p>
+        </w:tc>
+        <w:tc>
+          <w:tcPr>
+            <w:tcW w:type="dxa" w:w="4535"/>
+            <w:vAlign w:val="center"/>
+            <w:tcMar>
+              <w:top w:w="60" w:type="dxa"/>
+              <w:start w:w="100" w:type="dxa"/>
+              <w:bottom w:w="60" w:type="dxa"/>
+              <w:end w:w="100" w:type="dxa"/>
+            </w:tcMar>
+          </w:tcPr>
+          <w:p>
+            <w:pPr>
+              <w:spacing w:before="0" w:after="0" w:line="288" w:lineRule="auto"/>
+              <w:jc w:val="left"/>
+            </w:pPr>
+            <w:r>
+              <w:rPr>
+                <w:rFonts w:ascii="宋体" w:hAnsi="宋体" w:eastAsia="宋体" w:cs="宋体"/>
+                <w:b w:val="0"/>
+                <w:color w:val="000000"/>
+                <w:sz w:val="21"/>
+              </w:rPr>
+              <w:t>(80−42)/288</w:t>
+            </w:r>
+          </w:p>
+        </w:tc>
+        <w:tc>
+          <w:tcPr>
+            <w:tcW w:type="dxa" w:w="2903"/>
+            <w:vAlign w:val="center"/>
+            <w:tcMar>
+              <w:top w:w="60" w:type="dxa"/>
+              <w:start w:w="100" w:type="dxa"/>
+              <w:bottom w:w="60" w:type="dxa"/>
+              <w:end w:w="100" w:type="dxa"/>
+            </w:tcMar>
+          </w:tcPr>
+          <w:p>
+            <w:pPr>
+              <w:spacing w:before="0" w:after="0" w:line="288" w:lineRule="auto"/>
+              <w:jc w:val="left"/>
+            </w:pPr>
+            <w:r>
+              <w:rPr>
+                <w:rFonts w:ascii="宋体" w:hAnsi="宋体" w:eastAsia="宋体" w:cs="宋体"/>
+                <w:b w:val="0"/>
+                <w:color w:val="000000"/>
+                <w:sz w:val="21"/>
+              </w:rPr>
+              <w:t>13.2%</w:t>
+            </w:r>
+          </w:p>
+        </w:tc>
+      </w:tr>
+      <w:tr>
+        <w:trPr>
+          <w:cantSplit/>
+        </w:trPr>
+        <w:tc>
+          <w:tcPr>
+            <w:tcW w:type="dxa" w:w="1633"/>
+            <w:vAlign w:val="center"/>
+            <w:tcMar>
+              <w:top w:w="60" w:type="dxa"/>
+              <w:start w:w="100" w:type="dxa"/>
+              <w:bottom w:w="60" w:type="dxa"/>
+              <w:end w:w="100" w:type="dxa"/>
+            </w:tcMar>
+          </w:tcPr>
+          <w:p>
+            <w:pPr>
+              <w:spacing w:before="0" w:after="0" w:line="288" w:lineRule="auto"/>
+              <w:jc w:val="left"/>
+            </w:pPr>
+            <w:r>
+              <w:rPr>
+                <w:rFonts w:ascii="宋体" w:hAnsi="宋体" w:eastAsia="宋体" w:cs="宋体"/>
+                <w:b w:val="0"/>
+                <w:color w:val="000000"/>
+                <w:sz w:val="21"/>
+              </w:rPr>
+              <w:t>Zone%</w:t>
+            </w:r>
+          </w:p>
+        </w:tc>
+        <w:tc>
+          <w:tcPr>
+            <w:tcW w:type="dxa" w:w="4535"/>
+            <w:vAlign w:val="center"/>
+            <w:tcMar>
+              <w:top w:w="60" w:type="dxa"/>
+              <w:start w:w="100" w:type="dxa"/>
+              <w:bottom w:w="60" w:type="dxa"/>
+              <w:end w:w="100" w:type="dxa"/>
+            </w:tcMar>
+          </w:tcPr>
+          <w:p>
+            <w:pPr>
+              <w:spacing w:before="0" w:after="0" w:line="288" w:lineRule="auto"/>
+              <w:jc w:val="left"/>
+            </w:pPr>
+            <w:r>
+              <w:rPr>
+                <w:rFonts w:ascii="宋体" w:hAnsi="宋体" w:eastAsia="宋体" w:cs="宋体"/>
+                <w:b w:val="0"/>
+                <w:color w:val="000000"/>
+                <w:sz w:val="21"/>
+              </w:rPr>
+              <w:t>541/1,240</w:t>
+            </w:r>
+          </w:p>
+        </w:tc>
+        <w:tc>
+          <w:tcPr>
+            <w:tcW w:type="dxa" w:w="2903"/>
+            <w:vAlign w:val="center"/>
+            <w:tcMar>
+              <w:top w:w="60" w:type="dxa"/>
+              <w:start w:w="100" w:type="dxa"/>
+              <w:bottom w:w="60" w:type="dxa"/>
+              <w:end w:w="100" w:type="dxa"/>
+            </w:tcMar>
+          </w:tcPr>
+          <w:p>
+            <w:pPr>
+              <w:spacing w:before="0" w:after="0" w:line="288" w:lineRule="auto"/>
+              <w:jc w:val="left"/>
+            </w:pPr>
+            <w:r>
+              <w:rPr>
+                <w:rFonts w:ascii="宋体" w:hAnsi="宋体" w:eastAsia="宋体" w:cs="宋体"/>
+                <w:b w:val="0"/>
+                <w:color w:val="000000"/>
+                <w:sz w:val="21"/>
+              </w:rPr>
+              <w:t>43.6%</w:t>
+            </w:r>
+          </w:p>
+        </w:tc>
+      </w:tr>
+      <w:tr>
+        <w:trPr>
+          <w:cantSplit/>
+        </w:trPr>
+        <w:tc>
+          <w:tcPr>
+            <w:tcW w:type="dxa" w:w="1633"/>
+            <w:vAlign w:val="center"/>
+            <w:tcMar>
+              <w:top w:w="60" w:type="dxa"/>
+              <w:start w:w="100" w:type="dxa"/>
+              <w:bottom w:w="60" w:type="dxa"/>
+              <w:end w:w="100" w:type="dxa"/>
+            </w:tcMar>
+          </w:tcPr>
+          <w:p>
+            <w:pPr>
+              <w:spacing w:before="0" w:after="0" w:line="288" w:lineRule="auto"/>
+              <w:jc w:val="left"/>
+            </w:pPr>
+            <w:r>
+              <w:rPr>
+                <w:rFonts w:ascii="宋体" w:hAnsi="宋体" w:eastAsia="宋体" w:cs="宋体"/>
+                <w:b w:val="0"/>
+                <w:color w:val="000000"/>
+                <w:sz w:val="21"/>
+              </w:rPr>
+              <w:t>首球好球率</w:t>
+            </w:r>
+          </w:p>
+        </w:tc>
+        <w:tc>
+          <w:tcPr>
+            <w:tcW w:type="dxa" w:w="4535"/>
+            <w:vAlign w:val="center"/>
+            <w:tcMar>
+              <w:top w:w="60" w:type="dxa"/>
+              <w:start w:w="100" w:type="dxa"/>
+              <w:bottom w:w="60" w:type="dxa"/>
+              <w:end w:w="100" w:type="dxa"/>
+            </w:tcMar>
+          </w:tcPr>
+          <w:p>
+            <w:pPr>
+              <w:spacing w:before="0" w:after="0" w:line="288" w:lineRule="auto"/>
+              <w:jc w:val="left"/>
+            </w:pPr>
+            <w:r>
+              <w:rPr>
+                <w:rFonts w:ascii="宋体" w:hAnsi="宋体" w:eastAsia="宋体" w:cs="宋体"/>
+                <w:b w:val="0"/>
+                <w:color w:val="000000"/>
+                <w:sz w:val="21"/>
+              </w:rPr>
+              <w:t>149/288</w:t>
+            </w:r>
+          </w:p>
+        </w:tc>
+        <w:tc>
+          <w:tcPr>
+            <w:tcW w:type="dxa" w:w="2903"/>
+            <w:vAlign w:val="center"/>
+            <w:tcMar>
+              <w:top w:w="60" w:type="dxa"/>
+              <w:start w:w="100" w:type="dxa"/>
+              <w:bottom w:w="60" w:type="dxa"/>
+              <w:end w:w="100" w:type="dxa"/>
+            </w:tcMar>
+          </w:tcPr>
+          <w:p>
+            <w:pPr>
+              <w:spacing w:before="0" w:after="0" w:line="288" w:lineRule="auto"/>
+              <w:jc w:val="left"/>
+            </w:pPr>
+            <w:r>
+              <w:rPr>
+                <w:rFonts w:ascii="宋体" w:hAnsi="宋体" w:eastAsia="宋体" w:cs="宋体"/>
+                <w:b w:val="0"/>
+                <w:color w:val="000000"/>
+                <w:sz w:val="21"/>
+              </w:rPr>
+              <w:t>51.7%</w:t>
+            </w:r>
+          </w:p>
+        </w:tc>
+      </w:tr>
+      <w:tr>
+        <w:trPr>
+          <w:cantSplit/>
+        </w:trPr>
+        <w:tc>
+          <w:tcPr>
+            <w:tcW w:type="dxa" w:w="1633"/>
+            <w:vAlign w:val="center"/>
+            <w:tcMar>
+              <w:top w:w="60" w:type="dxa"/>
+              <w:start w:w="100" w:type="dxa"/>
+              <w:bottom w:w="60" w:type="dxa"/>
+              <w:end w:w="100" w:type="dxa"/>
+            </w:tcMar>
+          </w:tcPr>
+          <w:p>
+            <w:pPr>
+              <w:spacing w:before="0" w:after="0" w:line="288" w:lineRule="auto"/>
+              <w:jc w:val="left"/>
+            </w:pPr>
+            <w:r>
+              <w:rPr>
+                <w:rFonts w:ascii="宋体" w:hAnsi="宋体" w:eastAsia="宋体" w:cs="宋体"/>
+                <w:b w:val="0"/>
+                <w:color w:val="000000"/>
+                <w:sz w:val="21"/>
+              </w:rPr>
+              <w:t>Whiff%</w:t>
+            </w:r>
+          </w:p>
+        </w:tc>
+        <w:tc>
+          <w:tcPr>
+            <w:tcW w:type="dxa" w:w="4535"/>
+            <w:vAlign w:val="center"/>
+            <w:tcMar>
+              <w:top w:w="60" w:type="dxa"/>
+              <w:start w:w="100" w:type="dxa"/>
+              <w:bottom w:w="60" w:type="dxa"/>
+              <w:end w:w="100" w:type="dxa"/>
+            </w:tcMar>
+          </w:tcPr>
+          <w:p>
+            <w:pPr>
+              <w:spacing w:before="0" w:after="0" w:line="288" w:lineRule="auto"/>
+              <w:jc w:val="left"/>
+            </w:pPr>
+            <w:r>
+              <w:rPr>
+                <w:rFonts w:ascii="宋体" w:hAnsi="宋体" w:eastAsia="宋体" w:cs="宋体"/>
+                <w:b w:val="0"/>
+                <w:color w:val="000000"/>
+                <w:sz w:val="21"/>
+              </w:rPr>
+              <w:t>175/542</w:t>
+            </w:r>
+          </w:p>
+        </w:tc>
+        <w:tc>
+          <w:tcPr>
+            <w:tcW w:type="dxa" w:w="2903"/>
+            <w:vAlign w:val="center"/>
+            <w:tcMar>
+              <w:top w:w="60" w:type="dxa"/>
+              <w:start w:w="100" w:type="dxa"/>
+              <w:bottom w:w="60" w:type="dxa"/>
+              <w:end w:w="100" w:type="dxa"/>
+            </w:tcMar>
+          </w:tcPr>
+          <w:p>
+            <w:pPr>
+              <w:spacing w:before="0" w:after="0" w:line="288" w:lineRule="auto"/>
+              <w:jc w:val="left"/>
+            </w:pPr>
+            <w:r>
+              <w:rPr>
+                <w:rFonts w:ascii="宋体" w:hAnsi="宋体" w:eastAsia="宋体" w:cs="宋体"/>
+                <w:b w:val="0"/>
+                <w:color w:val="000000"/>
+                <w:sz w:val="21"/>
+              </w:rPr>
+              <w:t>32.3%</w:t>
+            </w:r>
+          </w:p>
+        </w:tc>
+      </w:tr>
+      <w:tr>
+        <w:trPr>
+          <w:cantSplit/>
+        </w:trPr>
+        <w:tc>
+          <w:tcPr>
+            <w:tcW w:type="dxa" w:w="1633"/>
+            <w:vAlign w:val="center"/>
+            <w:tcMar>
+              <w:top w:w="60" w:type="dxa"/>
+              <w:start w:w="100" w:type="dxa"/>
+              <w:bottom w:w="60" w:type="dxa"/>
+              <w:end w:w="100" w:type="dxa"/>
+            </w:tcMar>
+          </w:tcPr>
+          <w:p>
+            <w:pPr>
+              <w:spacing w:before="0" w:after="0" w:line="288" w:lineRule="auto"/>
+              <w:jc w:val="left"/>
+            </w:pPr>
+            <w:r>
+              <w:rPr>
+                <w:rFonts w:ascii="宋体" w:hAnsi="宋体" w:eastAsia="宋体" w:cs="宋体"/>
+                <w:b w:val="0"/>
+                <w:color w:val="000000"/>
+                <w:sz w:val="21"/>
+              </w:rPr>
+              <w:t>Chase%</w:t>
+            </w:r>
+          </w:p>
+        </w:tc>
+        <w:tc>
+          <w:tcPr>
+            <w:tcW w:type="dxa" w:w="4535"/>
+            <w:vAlign w:val="center"/>
+            <w:tcMar>
+              <w:top w:w="60" w:type="dxa"/>
+              <w:start w:w="100" w:type="dxa"/>
+              <w:bottom w:w="60" w:type="dxa"/>
+              <w:end w:w="100" w:type="dxa"/>
+            </w:tcMar>
+          </w:tcPr>
+          <w:p>
+            <w:pPr>
+              <w:spacing w:before="0" w:after="0" w:line="288" w:lineRule="auto"/>
+              <w:jc w:val="left"/>
+            </w:pPr>
+            <w:r>
+              <w:rPr>
+                <w:rFonts w:ascii="宋体" w:hAnsi="宋体" w:eastAsia="宋体" w:cs="宋体"/>
+                <w:b w:val="0"/>
+                <w:color w:val="000000"/>
+                <w:sz w:val="21"/>
+              </w:rPr>
+              <w:t>190/699</w:t>
+            </w:r>
+          </w:p>
+        </w:tc>
+        <w:tc>
+          <w:tcPr>
+            <w:tcW w:type="dxa" w:w="2903"/>
+            <w:vAlign w:val="center"/>
+            <w:tcMar>
+              <w:top w:w="60" w:type="dxa"/>
+              <w:start w:w="100" w:type="dxa"/>
+              <w:bottom w:w="60" w:type="dxa"/>
+              <w:end w:w="100" w:type="dxa"/>
+            </w:tcMar>
+          </w:tcPr>
+          <w:p>
+            <w:pPr>
+              <w:spacing w:before="0" w:after="0" w:line="288" w:lineRule="auto"/>
+              <w:jc w:val="left"/>
+            </w:pPr>
+            <w:r>
+              <w:rPr>
+                <w:rFonts w:ascii="宋体" w:hAnsi="宋体" w:eastAsia="宋体" w:cs="宋体"/>
+                <w:b w:val="0"/>
+                <w:color w:val="000000"/>
+                <w:sz w:val="21"/>
+              </w:rPr>
+              <w:t>27.2%</w:t>
+            </w:r>
+          </w:p>
+        </w:tc>
+      </w:tr>
+    </w:tbl>
+    <w:p>
+      <w:pPr>
+        <w:spacing w:before="0" w:after="40"/>
+      </w:pPr>
+    </w:p>
+    <w:p>
+      <w:pPr>
+        <w:widowControl/>
         <w:spacing w:after="80" w:line="360" w:lineRule="auto"/>
+        <w:ind w:firstLine="480"/>
         <w:jc w:val="both"/>
       </w:pPr>
       <w:r>
@@ -644,18 +2242,17 @@
           <w:color w:val="000000"/>
           <w:sz w:val="24"/>
         </w:rPr>
-        <w:t>K% = 三振 / 打席；BB% = 保送 / 打席；K-BB% = K% - BB%。</w:t>
+        <w:t>Wilson 95%区间用于比例指标，形式为</w:t>
       </w:r>
-    </w:p>
-    <w:p>
-      <w:pPr>
-        <w:numPr>
-          <w:ilvl w:val="0"/>
-          <w:numId w:val="14"/>
-        </w:numPr>
-        <w:spacing w:after="80" w:line="360" w:lineRule="auto"/>
-        <w:jc w:val="both"/>
-      </w:pPr>
+      <w:r>
+        <w:rPr>
+          <w:rFonts w:ascii="宋体" w:hAnsi="宋体" w:eastAsia="宋体" w:cs="宋体"/>
+          <w:b w:val="0"/>
+          <w:color w:val="000000"/>
+          <w:sz w:val="23"/>
+        </w:rPr>
+        <w:t>p̃ ± 1.96×标准误</w:t>
+      </w:r>
       <w:r>
         <w:rPr>
           <w:rFonts w:ascii="宋体" w:hAnsi="宋体" w:eastAsia="宋体" w:cs="宋体"/>
@@ -663,26 +2260,7 @@
           <w:color w:val="000000"/>
           <w:sz w:val="24"/>
         </w:rPr>
-        <w:t>ERA = 自责分 × 9 / 局数；xERA 取 Savant 赛季表。</w:t>
-      </w:r>
-    </w:p>
-    <w:p>
-      <w:pPr>
-        <w:numPr>
-          <w:ilvl w:val="0"/>
-          <w:numId w:val="14"/>
-        </w:numPr>
-        <w:spacing w:after="80" w:line="360" w:lineRule="auto"/>
-        <w:jc w:val="both"/>
-      </w:pPr>
-      <w:r>
-        <w:rPr>
-          <w:rFonts w:ascii="宋体" w:hAnsi="宋体" w:eastAsia="宋体" w:cs="宋体"/>
-          <w:b w:val="0"/>
-          <w:color w:val="000000"/>
-          <w:sz w:val="24"/>
-        </w:rPr>
-        <w:t>Run Value 采用投手视角：正值对投手有利，负值对投手不利；RV/100 = 投手 Run Value / 球数 × 100。</w:t>
+        <w:t>的 Wilson score 区间。它在牛棚等小样本中比普通正态近似更稳健，但仍不能把观察性角色差异变成因果结论。</w:t>
       </w:r>
     </w:p>
     <w:p>
@@ -696,116 +2274,7 @@
           <w:color w:val="000000"/>
           <w:sz w:val="26"/>
         </w:rPr>
-        <w:t>4.2 过程指标</w:t>
-      </w:r>
-    </w:p>
-    <w:p>
-      <w:pPr>
-        <w:numPr>
-          <w:ilvl w:val="0"/>
-          <w:numId w:val="15"/>
-        </w:numPr>
-        <w:spacing w:after="80" w:line="360" w:lineRule="auto"/>
-        <w:jc w:val="both"/>
-      </w:pPr>
-      <w:r>
-        <w:rPr>
-          <w:rFonts w:ascii="宋体" w:hAnsi="宋体" w:eastAsia="宋体" w:cs="宋体"/>
-          <w:b w:val="0"/>
-          <w:color w:val="000000"/>
-          <w:sz w:val="24"/>
-        </w:rPr>
-        <w:t>Zone%：坐标落在规则化好球区的投球数 / 有球种投球数。</w:t>
-      </w:r>
-    </w:p>
-    <w:p>
-      <w:pPr>
-        <w:numPr>
-          <w:ilvl w:val="0"/>
-          <w:numId w:val="15"/>
-        </w:numPr>
-        <w:spacing w:after="80" w:line="360" w:lineRule="auto"/>
-        <w:jc w:val="both"/>
-      </w:pPr>
-      <w:r>
-        <w:rPr>
-          <w:rFonts w:ascii="宋体" w:hAnsi="宋体" w:eastAsia="宋体" w:cs="宋体"/>
-          <w:b w:val="0"/>
-          <w:color w:val="000000"/>
-          <w:sz w:val="24"/>
-        </w:rPr>
-        <w:t>首球好球率：每个打席第一球被记录为好球结果的比例。</w:t>
-      </w:r>
-    </w:p>
-    <w:p>
-      <w:pPr>
-        <w:numPr>
-          <w:ilvl w:val="0"/>
-          <w:numId w:val="15"/>
-        </w:numPr>
-        <w:spacing w:after="80" w:line="360" w:lineRule="auto"/>
-        <w:jc w:val="both"/>
-      </w:pPr>
-      <w:r>
-        <w:rPr>
-          <w:rFonts w:ascii="宋体" w:hAnsi="宋体" w:eastAsia="宋体" w:cs="宋体"/>
-          <w:b w:val="0"/>
-          <w:color w:val="000000"/>
-          <w:sz w:val="24"/>
-        </w:rPr>
-        <w:t>Whiff%：挥空 / 挥棒；挥空包含 swinging strike、blocked swinging strike 和 foul tip。</w:t>
-      </w:r>
-    </w:p>
-    <w:p>
-      <w:pPr>
-        <w:numPr>
-          <w:ilvl w:val="0"/>
-          <w:numId w:val="15"/>
-        </w:numPr>
-        <w:spacing w:after="80" w:line="360" w:lineRule="auto"/>
-        <w:jc w:val="both"/>
-      </w:pPr>
-      <w:r>
-        <w:rPr>
-          <w:rFonts w:ascii="宋体" w:hAnsi="宋体" w:eastAsia="宋体" w:cs="宋体"/>
-          <w:b w:val="0"/>
-          <w:color w:val="000000"/>
-          <w:sz w:val="24"/>
-        </w:rPr>
-        <w:t>Chase%：好球区外挥棒 / 好球区外投球。</w:t>
-      </w:r>
-    </w:p>
-    <w:p>
-      <w:pPr>
-        <w:numPr>
-          <w:ilvl w:val="0"/>
-          <w:numId w:val="15"/>
-        </w:numPr>
-        <w:spacing w:after="80" w:line="360" w:lineRule="auto"/>
-        <w:jc w:val="both"/>
-      </w:pPr>
-      <w:r>
-        <w:rPr>
-          <w:rFonts w:ascii="宋体" w:hAnsi="宋体" w:eastAsia="宋体" w:cs="宋体"/>
-          <w:b w:val="0"/>
-          <w:color w:val="000000"/>
-          <w:sz w:val="24"/>
-        </w:rPr>
-        <w:t>95% 区间：二项比例 Wilson 区间，用于提醒牛棚小样本的不确定性。</w:t>
-      </w:r>
-    </w:p>
-    <w:p>
-      <w:pPr>
-        <w:pStyle w:val="Heading2"/>
-      </w:pPr>
-      <w:r>
-        <w:rPr>
-          <w:rFonts w:ascii="黑体" w:hAnsi="黑体" w:eastAsia="黑体" w:cs="黑体"/>
-          <w:b/>
-          <w:color w:val="000000"/>
-          <w:sz w:val="26"/>
-        </w:rPr>
-        <w:t>4.3 分组与限制</w:t>
+        <w:t>4.3 分组规则</w:t>
       </w:r>
     </w:p>
     <w:p>
@@ -822,7 +2291,7 @@
           <w:color w:val="000000"/>
           <w:sz w:val="24"/>
         </w:rPr>
-        <w:t xml:space="preserve">比赛日志标为 starter 的场次定义为先发，其余为牛棚。面对打线轮次由 </w:t>
+        <w:t>比赛日志中</w:t>
       </w:r>
       <w:r>
         <w:rPr>
@@ -831,7 +2300,7 @@
           <w:color w:val="000000"/>
           <w:sz w:val="23"/>
         </w:rPr>
-        <w:t>at_bat_number</w:t>
+        <w:t>gamesStarted=1</w:t>
       </w:r>
       <w:r>
         <w:rPr>
@@ -840,7 +2309,43 @@
           <w:color w:val="000000"/>
           <w:sz w:val="24"/>
         </w:rPr>
-        <w:t xml:space="preserve"> 和单场顺序近似重建；它是描述性分组。NPB xPV/100 与 MLB Run Value/100 的模型和环境不同，只比较“该球种在本联盟中相对有效或无效”的方向，不直接相减。</w:t>
+        <w:t>的场次标为先发，其余标为牛棚；再用</w:t>
+      </w:r>
+      <w:r>
+        <w:rPr>
+          <w:rFonts w:ascii="宋体" w:hAnsi="宋体" w:eastAsia="宋体" w:cs="宋体"/>
+          <w:b w:val="0"/>
+          <w:color w:val="000000"/>
+          <w:sz w:val="23"/>
+        </w:rPr>
+        <w:t>game_pk</w:t>
+      </w:r>
+      <w:r>
+        <w:rPr>
+          <w:rFonts w:ascii="宋体" w:hAnsi="宋体" w:eastAsia="宋体" w:cs="宋体"/>
+          <w:b w:val="0"/>
+          <w:color w:val="000000"/>
+          <w:sz w:val="24"/>
+        </w:rPr>
+        <w:t>把角色映射到每一球。面对打线轮次直接采用 Statcast 的</w:t>
+      </w:r>
+      <w:r>
+        <w:rPr>
+          <w:rFonts w:ascii="宋体" w:hAnsi="宋体" w:eastAsia="宋体" w:cs="宋体"/>
+          <w:b w:val="0"/>
+          <w:color w:val="000000"/>
+          <w:sz w:val="23"/>
+        </w:rPr>
+        <w:t>n_thruorder_pitcher</w:t>
+      </w:r>
+      <w:r>
+        <w:rPr>
+          <w:rFonts w:ascii="宋体" w:hAnsi="宋体" w:eastAsia="宋体" w:cs="宋体"/>
+          <w:b w:val="0"/>
+          <w:color w:val="000000"/>
+          <w:sz w:val="24"/>
+        </w:rPr>
+        <w:t>字段，而不是用打席序号自行猜测；该字段仍只用于描述性检查。球数按投手领先、打者领先、满球数和均势四组划分。NPB xPV/100 与 MLB Run Value/100 的模型、比赛环境和基准不同，只比较“球种在各自联盟中相对有效或无效”的方向，不直接相减。</w:t>
       </w:r>
     </w:p>
     <w:p>
@@ -871,7 +2376,7 @@
           <w:color w:val="000000"/>
           <w:sz w:val="24"/>
         </w:rPr>
-        <w:t>MLB 2026 的 ERA 5.29 和 xERA 4.89 都不理想，但 K% 仍为 27.8%，恰好等于 NPB 2025；Whiff% 32.3%，高于 Savant 页面同口径 MLB 平均 25.0%。因此“球威整体失效”不成立。</w:t>
+        <w:t>MLB 2026 的 ERA 5.29 和 xERA 4.89 都不理想，但 K%=80/288=27.8%，与 NPB 2025 的 27.8%相同；Whiff%=32.3%，高于 Savant 同页 MLB 平均 25.0%。四缝线平均 94.86 mph，也几乎等于 NPB 2025 的 94.87 mph。由此，“整体球威下降导致失败”缺少支持。</w:t>
       </w:r>
     </w:p>
     <w:p>
@@ -888,7 +2393,7 @@
           <w:color w:val="000000"/>
           <w:sz w:val="24"/>
         </w:rPr>
-        <w:t>相反，BB% 从 NPB 2025 的 7.0%升至 14.6%，增幅 7.6 个百分点，几乎翻倍；K-BB%由 20.7%降至 13.2%。今井不是无法结束打席，而是更难在结束之前进入有利球数。逐球过程也一致：Zone% 43.6%对 MLB 平均 48.7%，首球好球率 51.7%对平均 61.2%；Chase% 27.2%接近平均 28.6%。当打者不必更积极追坏球时，低进区率更容易转化成深球数与保送。</w:t>
+        <w:t>相反，BB%从 NPB 2025 的 7.0%升至 14.6%，K-BB%由 20.7%降至 13.2%。Zone% 43.6%低于 MLB 平均 48.7%，首球好球率 51.7%低于平均 61.2%；Chase% 27.2%则接近平均 28.6%。也就是说，打者并没有因为更加追坏球而帮助投手结束打席，偏低的进区和首球执行更容易转化为深球数与保送。</w:t>
       </w:r>
     </w:p>
     <w:p>
@@ -905,7 +2410,7 @@
           <w:color w:val="000000"/>
           <w:sz w:val="24"/>
         </w:rPr>
-        <w:t>结论：保留 H1 与 H2。首要训练目标应是可控地进区，而不是增加强度。</w:t>
+        <w:t>结论：保留 H1 与 H2。首要训练目标应是可重复地进区和抢 0—1，而不是继续增加强度。</w:t>
       </w:r>
     </w:p>
     <w:p>
@@ -992,7 +2497,7 @@
           <w:color w:val="000000"/>
           <w:sz w:val="24"/>
         </w:rPr>
-        <w:t>MLB 中四缝线 43.5%、滑球 45.3%，合计 88.9%。滑球 Whiff 40.6%、xwOBA .274、官方 Run Value +4，是可以继续围绕的终结武器。四缝线平均 94.86 mph，与 NPB 2025 的 94.87 mph几乎一致，再次反对“球速下降导致失败”。四缝线整体 Run Value -1、xwOBA .401，说明结果风险，但需要继续拆分。</w:t>
+        <w:t>MLB 中四缝线 540 球、滑球 562 球，合计占 88.9%。滑球使用率 45.3%、Whiff 40.6%、xwOBA .274、官方 Run Value +4，是可以继续围绕的终结武器。四缝线使用率 43.5%、Whiff 19.6%、xwOBA .401、官方 Run Value -1，整体有结果风险，但不能因此对所有情境一刀切。</w:t>
       </w:r>
     </w:p>
     <w:p>
@@ -1009,7 +2514,7 @@
           <w:color w:val="000000"/>
           <w:sz w:val="24"/>
         </w:rPr>
-        <w:t>关键新发现来自跨联盟球种结构。2025 年 NPB 变速球使用率 12.67%、Whiff 41.55%、xPV/100 +1.026，并不是尚未形成的试验球。MLB 中仅 29 球、使用率 2.34%。它的 MLB 表面 Whiff 62.5%和 Run Value -1 均因样本极小而不可直接推广；真正可信的是使用率断崖式下降和形态变化：均速由 84.73 mph升至 86.84 mph，而四缝线保持 94.86 mph，使速度差从约 10.14 mph缩至 8.01 mph。</w:t>
+        <w:t>关键变化来自跨联盟球种结构。NPB 2025 变速球使用率 12.67%、Whiff 41.55%、xPV/100 +1.026，并不是尚未形成的试验球。MLB 中仅 29 球，使用率 2.34%。它的 MLB 表面 Whiff 62.5%、官方 Run Value -1、xwOBA .875彼此矛盾，正说明小样本不能直接推广。更稳固的事实是使用率断崖式下降与形态变化：均速由 84.73 mph 升至 86.84 mph，而四缝线保持约 94.86 mph，使速度差从 10.14 mph 收窄到 8.01 mph。</w:t>
       </w:r>
     </w:p>
     <w:p>
@@ -1026,7 +2531,7 @@
           <w:color w:val="000000"/>
           <w:sz w:val="24"/>
         </w:rPr>
-        <w:t>问题由“开发一个第三球种”修正为“重建 2025 年已有证据的变速球”。目标包括出手隧道、横向/垂直形态和 8—10 mph速度差，不应仅凭 29 球的结果立刻大量使用。</w:t>
+        <w:t>因此，问题从“开发任意第三球种”改为“重建 2025 年已有证据的变速球”。操作上先确保速度差不继续低于约 8 mph，再尝试向 9—10 mph恢复；同时检查落点、横纵向移动、出手隧道和接触质量，不能把速度差当作唯一质量标准。</w:t>
       </w:r>
     </w:p>
     <w:p>
@@ -1057,7 +2562,7 @@
           <w:color w:val="000000"/>
           <w:sz w:val="24"/>
         </w:rPr>
-        <w:t>四缝线对左打 311 球，Whiff 15.4%、RV/100 -1.27；对右打 229 球，Whiff 27.0%、RV/100 +1.47。滑球对左、右打的 RV/100 分别为 +0.98 与 +0.11，均为正值。由此可见，笼统减少四缝线会错失其对右打的价值；真正需要改造的是对左打的四缝线位置与配套速度层。</w:t>
+        <w:t>四缝线对左打 311 球，Whiff 15.4%、RV/100 -1.27；对右打 229 球，Whiff 27.0%、RV/100 +1.47。滑球对左、右打的 RV/100 分别为 +0.98 和 +0.11，方向均为正。笼统减少四缝线会丢掉其对右打的价值；更具体的调整对象是对左打四缝线的位置与速度配套。</w:t>
       </w:r>
     </w:p>
     <w:p>
@@ -1074,7 +2579,7 @@
           <w:color w:val="000000"/>
           <w:sz w:val="24"/>
         </w:rPr>
-        <w:t>球数拆分也不支持简单规则。在满球数时四缝线 29 球，RV/100 +6.39；在投手领先时 134 球，RV/100 -1.91。由于这些分组仍受位置和选择偏差影响，建议不能写成“满球数只投四缝线”或“领先时不用四缝线”。更合理的训练要求是：对左打用能进区的四缝线建立边界，再用变速球改变速度与横向视觉，保留滑球作为挥空武器。</w:t>
+        <w:t>球数拆分也提醒不要制定机械规则。满球数四缝线只有 29 球，RV/100 +6.39；投手领先时 134 球，RV/100 -1.91。样本量、落点、打者质量和选择偏差都不同，不能写成“满球数只投四缝线”或“领先时不用四缝线”。训练重点应是让四缝线能对左打建立好球区边界，再由变速球改变速度和横向视觉，滑球继续承担挥空任务。</w:t>
       </w:r>
     </w:p>
     <w:p>
@@ -1105,7 +2610,7 @@
           <w:color w:val="000000"/>
           <w:sz w:val="24"/>
         </w:rPr>
-        <w:t>15 次先发共 1,151 球、265 打席，Zone% 43.4%（95% CI 40.6—46.3）、首球好球率 49.8%（43.8—55.8）、Whiff 31.6%（27.7—35.8）。两次牛棚共 89 球、23 打席，分别为 46.1%（36.1—56.4）、73.9%（53.5—87.5）、40.0%（27.0—54.5），Chase%也由 26.4%升至 37.5%。</w:t>
+        <w:t>15 场先发共 1,151 球、265 个打席，Zone% 43.4%（95% CI 40.6%—46.3%）、首球好球率 49.8%（43.8%—55.8%）、Whiff 31.6%（27.7%—35.8%）。两次牛棚共 89 球、23 个打席，三项指标分别为 46.1%（36.1%—56.4%）、73.9%（53.5%—87.5%）和 40.0%（27.0%—54.5%），Chase%也由 26.4%升至 37.5%。</w:t>
       </w:r>
     </w:p>
     <w:p>
@@ -1122,7 +2627,7 @@
           <w:color w:val="000000"/>
           <w:sz w:val="24"/>
         </w:rPr>
-        <w:t>改善方向一致，但置信区间宽且多数与先发重叠。四缝线均速从先发 94.87 mph略降至牛棚 94.72 mph，说明变化至少不是简单的“短局数带来更高球速”。面对打线第三轮 161 球的四缝线均速为 95.65 mph，也未出现疲劳性球速下降；其总 Run Value +4.39，反而优于第二轮。由此否定“第三轮必然崩盘”这一方便但证据不足的叙事。</w:t>
+        <w:t>方向一致，但区间较宽且多数重叠。四缝线均速从先发 94.87 mph 略降到牛棚 94.72 mph，至少不能把变化简单解释为“短局数带来更高球速”。面对打线第三轮的 161 球，四缝线均速 95.65 mph、投手 Run Value 合计 +4.39，也没有支持“第三轮必然因疲劳崩盘”。不过 161 球仍不足以证明永远不存在轮次效应。</w:t>
       </w:r>
     </w:p>
     <w:p>
@@ -1139,7 +2644,7 @@
           <w:color w:val="000000"/>
           <w:sz w:val="24"/>
         </w:rPr>
-        <w:t>结论：牛棚是重新练习进入好球区、缩小每次任务复杂度的合理环境，但目前不能证明永久后援角色更优。</w:t>
+        <w:t>结论：牛棚是重新练习进区、减少单次任务复杂度的合理环境，但现有数据不能证明永久后援角色更优。</w:t>
       </w:r>
     </w:p>
     <w:p>
@@ -1209,7 +2714,7 @@
           <w:color w:val="000000"/>
           <w:sz w:val="30"/>
         </w:rPr>
-        <w:t>9. 决策方案</w:t>
+        <w:t>9. 决策方案与停止规则</w:t>
       </w:r>
     </w:p>
     <w:p>
@@ -1240,7 +2745,7 @@
           <w:color w:val="000000"/>
           <w:sz w:val="24"/>
         </w:rPr>
-        <w:t>先确认右臂疲劳无复发，保留 1—2 局多局牛棚。训练分为三条：四缝线 glove-side 进区重复性；滑球的 chase 区与非竞争坏球分离；变速球恢复 8—10 mph速度差和与四缝线相同的早期轨迹。比赛使用率逐步提升，避免一次性跳到 2025 NPB 水平。</w:t>
+        <w:t>先确认右臂疲劳没有复发，保留每次 1—2 局的多局牛棚。训练拆成三条：四缝线 glove-side 进区重复性；滑球 chase 区与非竞争坏球的分离；变速球恢复与四缝线相似的早期轨迹和足够速度差。比赛使用率逐步上升，不从 2.3%一次跳到 NPB 的 12.7%。</w:t>
       </w:r>
     </w:p>
     <w:p>
@@ -1257,6 +2762,467 @@
         <w:t>9.2 阶段 B：过程门槛</w:t>
       </w:r>
     </w:p>
+    <w:tbl>
+      <w:tblPr>
+        <w:tblW w:type="dxa" w:w="9071"/>
+        <w:jc w:val="left"/>
+        <w:tblLayout w:type="fixed"/>
+        <w:tblLook w:firstColumn="1" w:firstRow="1" w:lastColumn="0" w:lastRow="0" w:noHBand="0" w:noVBand="1" w:val="04A0"/>
+        <w:tblInd w:w="100" w:type="dxa"/>
+        <w:tblBorders>
+          <w:top w:val="single" w:sz="4" w:space="0" w:color="808080"/>
+          <w:left w:val="single" w:sz="4" w:space="0" w:color="808080"/>
+          <w:bottom w:val="single" w:sz="4" w:space="0" w:color="808080"/>
+          <w:right w:val="single" w:sz="4" w:space="0" w:color="808080"/>
+          <w:insideH w:val="single" w:sz="4" w:space="0" w:color="808080"/>
+          <w:insideV w:val="single" w:sz="4" w:space="0" w:color="808080"/>
+        </w:tblBorders>
+      </w:tblPr>
+      <w:tblGrid>
+        <w:gridCol w:w="1633"/>
+        <w:gridCol w:w="4535"/>
+        <w:gridCol w:w="2903"/>
+      </w:tblGrid>
+      <w:tr>
+        <w:trPr>
+          <w:cantSplit/>
+          <w:tblHeader/>
+        </w:trPr>
+        <w:tc>
+          <w:tcPr>
+            <w:tcW w:type="dxa" w:w="1633"/>
+            <w:vAlign w:val="center"/>
+            <w:tcMar>
+              <w:top w:w="60" w:type="dxa"/>
+              <w:start w:w="100" w:type="dxa"/>
+              <w:bottom w:w="60" w:type="dxa"/>
+              <w:end w:w="100" w:type="dxa"/>
+            </w:tcMar>
+            <w:shd w:val="clear" w:color="auto" w:fill="D9D9D9"/>
+          </w:tcPr>
+          <w:p>
+            <w:pPr>
+              <w:spacing w:before="0" w:after="0" w:line="288" w:lineRule="auto"/>
+              <w:jc w:val="left"/>
+            </w:pPr>
+            <w:r>
+              <w:rPr>
+                <w:rFonts w:ascii="宋体" w:hAnsi="宋体" w:eastAsia="宋体" w:cs="宋体"/>
+                <w:b/>
+                <w:color w:val="000000"/>
+                <w:sz w:val="21"/>
+              </w:rPr>
+              <w:t>观察对象</w:t>
+            </w:r>
+          </w:p>
+        </w:tc>
+        <w:tc>
+          <w:tcPr>
+            <w:tcW w:type="dxa" w:w="4535"/>
+            <w:vAlign w:val="center"/>
+            <w:tcMar>
+              <w:top w:w="60" w:type="dxa"/>
+              <w:start w:w="100" w:type="dxa"/>
+              <w:bottom w:w="60" w:type="dxa"/>
+              <w:end w:w="100" w:type="dxa"/>
+            </w:tcMar>
+            <w:shd w:val="clear" w:color="auto" w:fill="D9D9D9"/>
+          </w:tcPr>
+          <w:p>
+            <w:pPr>
+              <w:spacing w:before="0" w:after="0" w:line="288" w:lineRule="auto"/>
+              <w:jc w:val="left"/>
+            </w:pPr>
+            <w:r>
+              <w:rPr>
+                <w:rFonts w:ascii="宋体" w:hAnsi="宋体" w:eastAsia="宋体" w:cs="宋体"/>
+                <w:b/>
+                <w:color w:val="000000"/>
+                <w:sz w:val="21"/>
+              </w:rPr>
+              <w:t>升级条件</w:t>
+            </w:r>
+          </w:p>
+        </w:tc>
+        <w:tc>
+          <w:tcPr>
+            <w:tcW w:type="dxa" w:w="2903"/>
+            <w:vAlign w:val="center"/>
+            <w:tcMar>
+              <w:top w:w="60" w:type="dxa"/>
+              <w:start w:w="100" w:type="dxa"/>
+              <w:bottom w:w="60" w:type="dxa"/>
+              <w:end w:w="100" w:type="dxa"/>
+            </w:tcMar>
+            <w:shd w:val="clear" w:color="auto" w:fill="D9D9D9"/>
+          </w:tcPr>
+          <w:p>
+            <w:pPr>
+              <w:spacing w:before="0" w:after="0" w:line="288" w:lineRule="auto"/>
+              <w:jc w:val="left"/>
+            </w:pPr>
+            <w:r>
+              <w:rPr>
+                <w:rFonts w:ascii="宋体" w:hAnsi="宋体" w:eastAsia="宋体" w:cs="宋体"/>
+                <w:b/>
+                <w:color w:val="000000"/>
+                <w:sz w:val="21"/>
+              </w:rPr>
+              <w:t>退回或继续校准条件</w:t>
+            </w:r>
+          </w:p>
+        </w:tc>
+      </w:tr>
+      <w:tr>
+        <w:trPr>
+          <w:cantSplit/>
+        </w:trPr>
+        <w:tc>
+          <w:tcPr>
+            <w:tcW w:type="dxa" w:w="1633"/>
+            <w:vAlign w:val="center"/>
+            <w:tcMar>
+              <w:top w:w="60" w:type="dxa"/>
+              <w:start w:w="100" w:type="dxa"/>
+              <w:bottom w:w="60" w:type="dxa"/>
+              <w:end w:w="100" w:type="dxa"/>
+            </w:tcMar>
+          </w:tcPr>
+          <w:p>
+            <w:pPr>
+              <w:spacing w:before="0" w:after="0" w:line="288" w:lineRule="auto"/>
+              <w:jc w:val="left"/>
+            </w:pPr>
+            <w:r>
+              <w:rPr>
+                <w:rFonts w:ascii="宋体" w:hAnsi="宋体" w:eastAsia="宋体" w:cs="宋体"/>
+                <w:b w:val="0"/>
+                <w:color w:val="000000"/>
+                <w:sz w:val="21"/>
+              </w:rPr>
+              <w:t>连续样本</w:t>
+            </w:r>
+          </w:p>
+        </w:tc>
+        <w:tc>
+          <w:tcPr>
+            <w:tcW w:type="dxa" w:w="4535"/>
+            <w:vAlign w:val="center"/>
+            <w:tcMar>
+              <w:top w:w="60" w:type="dxa"/>
+              <w:start w:w="100" w:type="dxa"/>
+              <w:bottom w:w="60" w:type="dxa"/>
+              <w:end w:w="100" w:type="dxa"/>
+            </w:tcMar>
+          </w:tcPr>
+          <w:p>
+            <w:pPr>
+              <w:spacing w:before="0" w:after="0" w:line="288" w:lineRule="auto"/>
+              <w:jc w:val="left"/>
+            </w:pPr>
+            <w:r>
+              <w:rPr>
+                <w:rFonts w:ascii="宋体" w:hAnsi="宋体" w:eastAsia="宋体" w:cs="宋体"/>
+                <w:b w:val="0"/>
+                <w:color w:val="000000"/>
+                <w:sz w:val="21"/>
+              </w:rPr>
+              <w:t>至少 60 个打席</w:t>
+            </w:r>
+          </w:p>
+        </w:tc>
+        <w:tc>
+          <w:tcPr>
+            <w:tcW w:type="dxa" w:w="2903"/>
+            <w:vAlign w:val="center"/>
+            <w:tcMar>
+              <w:top w:w="60" w:type="dxa"/>
+              <w:start w:w="100" w:type="dxa"/>
+              <w:bottom w:w="60" w:type="dxa"/>
+              <w:end w:w="100" w:type="dxa"/>
+            </w:tcMar>
+          </w:tcPr>
+          <w:p>
+            <w:pPr>
+              <w:spacing w:before="0" w:after="0" w:line="288" w:lineRule="auto"/>
+              <w:jc w:val="left"/>
+            </w:pPr>
+            <w:r>
+              <w:rPr>
+                <w:rFonts w:ascii="宋体" w:hAnsi="宋体" w:eastAsia="宋体" w:cs="宋体"/>
+                <w:b w:val="0"/>
+                <w:color w:val="000000"/>
+                <w:sz w:val="21"/>
+              </w:rPr>
+              <w:t>样本不足只记录，不下角色结论</w:t>
+            </w:r>
+          </w:p>
+        </w:tc>
+      </w:tr>
+      <w:tr>
+        <w:trPr>
+          <w:cantSplit/>
+        </w:trPr>
+        <w:tc>
+          <w:tcPr>
+            <w:tcW w:type="dxa" w:w="1633"/>
+            <w:vAlign w:val="center"/>
+            <w:tcMar>
+              <w:top w:w="60" w:type="dxa"/>
+              <w:start w:w="100" w:type="dxa"/>
+              <w:bottom w:w="60" w:type="dxa"/>
+              <w:end w:w="100" w:type="dxa"/>
+            </w:tcMar>
+          </w:tcPr>
+          <w:p>
+            <w:pPr>
+              <w:spacing w:before="0" w:after="0" w:line="288" w:lineRule="auto"/>
+              <w:jc w:val="left"/>
+            </w:pPr>
+            <w:r>
+              <w:rPr>
+                <w:rFonts w:ascii="宋体" w:hAnsi="宋体" w:eastAsia="宋体" w:cs="宋体"/>
+                <w:b w:val="0"/>
+                <w:color w:val="000000"/>
+                <w:sz w:val="21"/>
+              </w:rPr>
+              <w:t>控球</w:t>
+            </w:r>
+          </w:p>
+        </w:tc>
+        <w:tc>
+          <w:tcPr>
+            <w:tcW w:type="dxa" w:w="4535"/>
+            <w:vAlign w:val="center"/>
+            <w:tcMar>
+              <w:top w:w="60" w:type="dxa"/>
+              <w:start w:w="100" w:type="dxa"/>
+              <w:bottom w:w="60" w:type="dxa"/>
+              <w:end w:w="100" w:type="dxa"/>
+            </w:tcMar>
+          </w:tcPr>
+          <w:p>
+            <w:pPr>
+              <w:spacing w:before="0" w:after="0" w:line="288" w:lineRule="auto"/>
+              <w:jc w:val="left"/>
+            </w:pPr>
+            <w:r>
+              <w:rPr>
+                <w:rFonts w:ascii="宋体" w:hAnsi="宋体" w:eastAsia="宋体" w:cs="宋体"/>
+                <w:b w:val="0"/>
+                <w:color w:val="000000"/>
+                <w:sz w:val="21"/>
+              </w:rPr>
+              <w:t>Zone%≥46%、首球好球率≥60%、BB%≤10%</w:t>
+            </w:r>
+          </w:p>
+        </w:tc>
+        <w:tc>
+          <w:tcPr>
+            <w:tcW w:type="dxa" w:w="2903"/>
+            <w:vAlign w:val="center"/>
+            <w:tcMar>
+              <w:top w:w="60" w:type="dxa"/>
+              <w:start w:w="100" w:type="dxa"/>
+              <w:bottom w:w="60" w:type="dxa"/>
+              <w:end w:w="100" w:type="dxa"/>
+            </w:tcMar>
+          </w:tcPr>
+          <w:p>
+            <w:pPr>
+              <w:spacing w:before="0" w:after="0" w:line="288" w:lineRule="auto"/>
+              <w:jc w:val="left"/>
+            </w:pPr>
+            <w:r>
+              <w:rPr>
+                <w:rFonts w:ascii="宋体" w:hAnsi="宋体" w:eastAsia="宋体" w:cs="宋体"/>
+                <w:b w:val="0"/>
+                <w:color w:val="000000"/>
+                <w:sz w:val="21"/>
+              </w:rPr>
+              <w:t>BB%重新高于 12%或进区、首球同时回落</w:t>
+            </w:r>
+          </w:p>
+        </w:tc>
+      </w:tr>
+      <w:tr>
+        <w:trPr>
+          <w:cantSplit/>
+        </w:trPr>
+        <w:tc>
+          <w:tcPr>
+            <w:tcW w:type="dxa" w:w="1633"/>
+            <w:vAlign w:val="center"/>
+            <w:tcMar>
+              <w:top w:w="60" w:type="dxa"/>
+              <w:start w:w="100" w:type="dxa"/>
+              <w:bottom w:w="60" w:type="dxa"/>
+              <w:end w:w="100" w:type="dxa"/>
+            </w:tcMar>
+          </w:tcPr>
+          <w:p>
+            <w:pPr>
+              <w:spacing w:before="0" w:after="0" w:line="288" w:lineRule="auto"/>
+              <w:jc w:val="left"/>
+            </w:pPr>
+            <w:r>
+              <w:rPr>
+                <w:rFonts w:ascii="宋体" w:hAnsi="宋体" w:eastAsia="宋体" w:cs="宋体"/>
+                <w:b w:val="0"/>
+                <w:color w:val="000000"/>
+                <w:sz w:val="21"/>
+              </w:rPr>
+              <w:t>变速球</w:t>
+            </w:r>
+          </w:p>
+        </w:tc>
+        <w:tc>
+          <w:tcPr>
+            <w:tcW w:type="dxa" w:w="4535"/>
+            <w:vAlign w:val="center"/>
+            <w:tcMar>
+              <w:top w:w="60" w:type="dxa"/>
+              <w:start w:w="100" w:type="dxa"/>
+              <w:bottom w:w="60" w:type="dxa"/>
+              <w:end w:w="100" w:type="dxa"/>
+            </w:tcMar>
+          </w:tcPr>
+          <w:p>
+            <w:pPr>
+              <w:spacing w:before="0" w:after="0" w:line="288" w:lineRule="auto"/>
+              <w:jc w:val="left"/>
+            </w:pPr>
+            <w:r>
+              <w:rPr>
+                <w:rFonts w:ascii="宋体" w:hAnsi="宋体" w:eastAsia="宋体" w:cs="宋体"/>
+                <w:b w:val="0"/>
+                <w:color w:val="000000"/>
+                <w:sz w:val="21"/>
+              </w:rPr>
+              <w:t>使用率 8%—12%；速度差不低于约 8 mph并向 9—10 mph恢复；落点、移动与接触质量未共同恶化</w:t>
+            </w:r>
+          </w:p>
+        </w:tc>
+        <w:tc>
+          <w:tcPr>
+            <w:tcW w:type="dxa" w:w="2903"/>
+            <w:vAlign w:val="center"/>
+            <w:tcMar>
+              <w:top w:w="60" w:type="dxa"/>
+              <w:start w:w="100" w:type="dxa"/>
+              <w:bottom w:w="60" w:type="dxa"/>
+              <w:end w:w="100" w:type="dxa"/>
+            </w:tcMar>
+          </w:tcPr>
+          <w:p>
+            <w:pPr>
+              <w:spacing w:before="0" w:after="0" w:line="288" w:lineRule="auto"/>
+              <w:jc w:val="left"/>
+            </w:pPr>
+            <w:r>
+              <w:rPr>
+                <w:rFonts w:ascii="宋体" w:hAnsi="宋体" w:eastAsia="宋体" w:cs="宋体"/>
+                <w:b w:val="0"/>
+                <w:color w:val="000000"/>
+                <w:sz w:val="21"/>
+              </w:rPr>
+              <w:t>速度差继续收窄，或挥空与接触质量同时恶化</w:t>
+            </w:r>
+          </w:p>
+        </w:tc>
+      </w:tr>
+      <w:tr>
+        <w:trPr>
+          <w:cantSplit/>
+        </w:trPr>
+        <w:tc>
+          <w:tcPr>
+            <w:tcW w:type="dxa" w:w="1633"/>
+            <w:vAlign w:val="center"/>
+            <w:tcMar>
+              <w:top w:w="60" w:type="dxa"/>
+              <w:start w:w="100" w:type="dxa"/>
+              <w:bottom w:w="60" w:type="dxa"/>
+              <w:end w:w="100" w:type="dxa"/>
+            </w:tcMar>
+          </w:tcPr>
+          <w:p>
+            <w:pPr>
+              <w:spacing w:before="0" w:after="0" w:line="288" w:lineRule="auto"/>
+              <w:jc w:val="left"/>
+            </w:pPr>
+            <w:r>
+              <w:rPr>
+                <w:rFonts w:ascii="宋体" w:hAnsi="宋体" w:eastAsia="宋体" w:cs="宋体"/>
+                <w:b w:val="0"/>
+                <w:color w:val="000000"/>
+                <w:sz w:val="21"/>
+              </w:rPr>
+              <w:t>健康动作</w:t>
+            </w:r>
+          </w:p>
+        </w:tc>
+        <w:tc>
+          <w:tcPr>
+            <w:tcW w:type="dxa" w:w="4535"/>
+            <w:vAlign w:val="center"/>
+            <w:tcMar>
+              <w:top w:w="60" w:type="dxa"/>
+              <w:start w:w="100" w:type="dxa"/>
+              <w:bottom w:w="60" w:type="dxa"/>
+              <w:end w:w="100" w:type="dxa"/>
+            </w:tcMar>
+          </w:tcPr>
+          <w:p>
+            <w:pPr>
+              <w:spacing w:before="0" w:after="0" w:line="288" w:lineRule="auto"/>
+              <w:jc w:val="left"/>
+            </w:pPr>
+            <w:r>
+              <w:rPr>
+                <w:rFonts w:ascii="宋体" w:hAnsi="宋体" w:eastAsia="宋体" w:cs="宋体"/>
+                <w:b w:val="0"/>
+                <w:color w:val="000000"/>
+                <w:sz w:val="21"/>
+              </w:rPr>
+              <w:t>热身、出手节奏稳定且无右臂疲劳</w:t>
+            </w:r>
+          </w:p>
+        </w:tc>
+        <w:tc>
+          <w:tcPr>
+            <w:tcW w:type="dxa" w:w="2903"/>
+            <w:vAlign w:val="center"/>
+            <w:tcMar>
+              <w:top w:w="60" w:type="dxa"/>
+              <w:start w:w="100" w:type="dxa"/>
+              <w:bottom w:w="60" w:type="dxa"/>
+              <w:end w:w="100" w:type="dxa"/>
+            </w:tcMar>
+          </w:tcPr>
+          <w:p>
+            <w:pPr>
+              <w:spacing w:before="0" w:after="0" w:line="288" w:lineRule="auto"/>
+              <w:jc w:val="left"/>
+            </w:pPr>
+            <w:r>
+              <w:rPr>
+                <w:rFonts w:ascii="宋体" w:hAnsi="宋体" w:eastAsia="宋体" w:cs="宋体"/>
+                <w:b w:val="0"/>
+                <w:color w:val="000000"/>
+                <w:sz w:val="21"/>
+              </w:rPr>
+              <w:t>疲劳、疼痛或动作重复性恶化即暂停加量</w:t>
+            </w:r>
+          </w:p>
+        </w:tc>
+      </w:tr>
+    </w:tbl>
+    <w:p>
+      <w:pPr>
+        <w:spacing w:before="0" w:after="40"/>
+      </w:pPr>
+    </w:p>
     <w:p>
       <w:pPr>
         <w:widowControl/>
@@ -1271,7 +3237,7 @@
           <w:color w:val="000000"/>
           <w:sz w:val="24"/>
         </w:rPr>
-        <w:t>至少连续 60 个打席同时满足：Zone% ≥46%、首球好球率 ≥60%、BB% ≤10%；变速球使用率在 8%—12%，主要对左打；球速差、挥空和接触质量中至少两项稳定。这里的阈值是综合 MLB 平均、今井牛棚初始信号和其 NPB 能力形成的操作规则，不是统计上估计出的真实分界点。</w:t>
+        <w:t>这些阈值是综合 MLB 平均、今井初始牛棚信号和 NPB 历史能力形成的操作规则，不是从当前小样本估出的“真实分界点”。</w:t>
       </w:r>
     </w:p>
     <w:p>
@@ -1302,7 +3268,7 @@
           <w:color w:val="000000"/>
           <w:sz w:val="24"/>
         </w:rPr>
-        <w:t>按 45→60→75 球进行长局数，每阶至少两次。检查后半段 Zone%、首球好球率、四缝线球速和变速球速度差；若 BB%重新高于 12%、动作指标恶化或出现疲劳，退回上一阶。只有健康和过程都达标才进入正式先发。</w:t>
+        <w:t>过程门槛通过后，按 45→60→75 球增加长局数，每阶至少两次。每次都比较前后半段 Zone%、首球好球率、四缝线球速和变速球速度差。任一阶段 BB%超过 12%、动作恶化或疲劳复发，退回上一阶；只有健康与过程同时达标才进入下一阶。</w:t>
       </w:r>
     </w:p>
     <w:p>
@@ -1323,7 +3289,7 @@
       <w:pPr>
         <w:numPr>
           <w:ilvl w:val="0"/>
-          <w:numId w:val="16"/>
+          <w:numId w:val="14"/>
         </w:numPr>
         <w:spacing w:after="80" w:line="360" w:lineRule="auto"/>
         <w:jc w:val="both"/>
@@ -1335,14 +3301,14 @@
           <w:color w:val="000000"/>
           <w:sz w:val="24"/>
         </w:rPr>
-        <w:t>60—75 球仍达标：重返传统先发。</w:t>
+        <w:t>在 60—75 球阶段仍稳定达标：重返传统先发。</w:t>
       </w:r>
     </w:p>
     <w:p>
       <w:pPr>
         <w:numPr>
           <w:ilvl w:val="0"/>
-          <w:numId w:val="16"/>
+          <w:numId w:val="14"/>
         </w:numPr>
         <w:spacing w:after="80" w:line="360" w:lineRule="auto"/>
         <w:jc w:val="both"/>
@@ -1354,14 +3320,14 @@
           <w:color w:val="000000"/>
           <w:sz w:val="24"/>
         </w:rPr>
-        <w:t>前两轮稳定、第三轮在扩大样本后持续失效：使用“一次打线+”、跟随投手或四至五局短先发。</w:t>
+        <w:t>前两轮稳定、第三轮在更大样本中持续失效：采用“一次打线+”、跟随投手或四至五局短先发。</w:t>
       </w:r>
     </w:p>
     <w:p>
       <w:pPr>
         <w:numPr>
           <w:ilvl w:val="0"/>
-          <w:numId w:val="16"/>
+          <w:numId w:val="14"/>
         </w:numPr>
         <w:spacing w:after="80" w:line="360" w:lineRule="auto"/>
         <w:jc w:val="both"/>
@@ -1373,7 +3339,7 @@
           <w:color w:val="000000"/>
           <w:sz w:val="24"/>
         </w:rPr>
-        <w:t>控球在牛棚也无法恢复：暂停负荷升级，重新评估健康、动作与球种握法，而不是用更多滑球掩盖进区问题。</w:t>
+        <w:t>控球在牛棚也无法恢复：暂停负荷升级，重新评估健康、动作与握法，而不是用更多滑球掩盖进区问题。</w:t>
       </w:r>
     </w:p>
     <w:p>
@@ -1387,14 +3353,14 @@
           <w:color w:val="000000"/>
           <w:sz w:val="30"/>
         </w:rPr>
-        <w:t>10. 稳健性与替代解释</w:t>
+        <w:t>10. 稳健性、反证与未解决问题</w:t>
       </w:r>
     </w:p>
     <w:p>
       <w:pPr>
         <w:numPr>
           <w:ilvl w:val="0"/>
-          <w:numId w:val="17"/>
+          <w:numId w:val="15"/>
         </w:numPr>
         <w:spacing w:after="80" w:line="360" w:lineRule="auto"/>
         <w:jc w:val="both"/>
@@ -1406,14 +3372,14 @@
           <w:color w:val="000000"/>
           <w:sz w:val="24"/>
         </w:rPr>
-        <w:t>ERA 受防守、时序和小样本波动影响，因此同时报告 xERA 和过程指标。</w:t>
+        <w:t>ERA 受防守、得点时序和小样本波动影响，因此同时报告 xERA、K-BB%和过程指标。</w:t>
       </w:r>
     </w:p>
     <w:p>
       <w:pPr>
         <w:numPr>
           <w:ilvl w:val="0"/>
-          <w:numId w:val="17"/>
+          <w:numId w:val="15"/>
         </w:numPr>
         <w:spacing w:after="80" w:line="360" w:lineRule="auto"/>
         <w:jc w:val="both"/>
@@ -1425,14 +3391,14 @@
           <w:color w:val="000000"/>
           <w:sz w:val="24"/>
         </w:rPr>
-        <w:t>自动好坏球事件可能缺少球种标签，主球种表排除 1 行；三振与保送由 StatsAPI 对账。</w:t>
+        <w:t>自动坏球事件可能没有球种标签。主球种表排除 1 行，但三振、保送和比赛总量用 StatsAPI 对账。</w:t>
       </w:r>
     </w:p>
     <w:p>
       <w:pPr>
         <w:numPr>
           <w:ilvl w:val="0"/>
-          <w:numId w:val="17"/>
+          <w:numId w:val="15"/>
         </w:numPr>
         <w:spacing w:after="80" w:line="360" w:lineRule="auto"/>
         <w:jc w:val="both"/>
@@ -1444,14 +3410,14 @@
           <w:color w:val="000000"/>
           <w:sz w:val="24"/>
         </w:rPr>
-        <w:t>NPB 到 MLB 有比赛用球、打者水平、球场和追踪系统差异，跨联盟比较只用于识别结构变化。</w:t>
+        <w:t>NPB 到 MLB 存在比赛用球、打者水平、球场和追踪系统差异，跨联盟比较只用于识别结构变化。</w:t>
       </w:r>
     </w:p>
     <w:p>
       <w:pPr>
         <w:numPr>
           <w:ilvl w:val="0"/>
-          <w:numId w:val="17"/>
+          <w:numId w:val="15"/>
         </w:numPr>
         <w:spacing w:after="80" w:line="360" w:lineRule="auto"/>
         <w:jc w:val="both"/>
@@ -1463,14 +3429,14 @@
           <w:color w:val="000000"/>
           <w:sz w:val="24"/>
         </w:rPr>
-        <w:t>伤病、赛程和角色变化混杂牛棚前后比较；没有随机分配，不能写因果。</w:t>
+        <w:t>伤病、赛程、对手和角色变化混杂牛棚前后比较；没有随机分配，不能作因果表述。</w:t>
       </w:r>
     </w:p>
     <w:p>
       <w:pPr>
         <w:numPr>
           <w:ilvl w:val="0"/>
-          <w:numId w:val="17"/>
+          <w:numId w:val="15"/>
         </w:numPr>
         <w:spacing w:after="80" w:line="360" w:lineRule="auto"/>
         <w:jc w:val="both"/>
@@ -1482,14 +3448,14 @@
           <w:color w:val="000000"/>
           <w:sz w:val="24"/>
         </w:rPr>
-        <w:t>变速球 MLB 只有 29 球，不能用其 .875 xwOBA 或 62.5% Whiff 判断真实质量；建议来自 NPB 成熟证据、使用率下降与速度差变化的联合证据。</w:t>
+        <w:t>变速球 MLB 只有 29 球，不能用 .875 xwOBA 或 62.5% Whiff 推断真实质量。建议来自历史成熟度、使用率下降和速度差变化的联合证据。</w:t>
       </w:r>
     </w:p>
     <w:p>
       <w:pPr>
         <w:numPr>
           <w:ilvl w:val="0"/>
-          <w:numId w:val="17"/>
+          <w:numId w:val="15"/>
         </w:numPr>
         <w:spacing w:after="80" w:line="360" w:lineRule="auto"/>
         <w:jc w:val="both"/>
@@ -1501,7 +3467,43 @@
           <w:color w:val="000000"/>
           <w:sz w:val="24"/>
         </w:rPr>
-        <w:t>面对打线轮次的结果不支持简单疲劳叙事，但第三轮只有 161 球，也不足以证明永远不存在轮次效应。</w:t>
+        <w:t>第三轮结果没有支持简单疲劳叙事，但 161 球同样不足以证明轮次效应不存在。</w:t>
+      </w:r>
+    </w:p>
+    <w:p>
+      <w:pPr>
+        <w:numPr>
+          <w:ilvl w:val="0"/>
+          <w:numId w:val="15"/>
+        </w:numPr>
+        <w:spacing w:after="80" w:line="360" w:lineRule="auto"/>
+        <w:jc w:val="both"/>
+      </w:pPr>
+      <w:r>
+        <w:rPr>
+          <w:rFonts w:ascii="宋体" w:hAnsi="宋体" w:eastAsia="宋体" w:cs="宋体"/>
+          <w:b w:val="0"/>
+          <w:color w:val="000000"/>
+          <w:sz w:val="24"/>
+        </w:rPr>
+        <w:t>本研究没有球队内部动作捕捉、握力、伤病影像和训练场 TrackMan 数据；健康与球形调整必须由实际投教、医疗团队补充。</w:t>
+      </w:r>
+    </w:p>
+    <w:p>
+      <w:pPr>
+        <w:widowControl/>
+        <w:spacing w:after="80" w:line="360" w:lineRule="auto"/>
+        <w:ind w:firstLine="480"/>
+        <w:jc w:val="both"/>
+      </w:pPr>
+      <w:r>
+        <w:rPr>
+          <w:rFonts w:ascii="宋体" w:hAnsi="宋体" w:eastAsia="宋体" w:cs="宋体"/>
+          <w:b w:val="0"/>
+          <w:color w:val="000000"/>
+          <w:sz w:val="24"/>
+        </w:rPr>
+        <w:t>能够推翻当前建议的证据包括：在扩大样本后变速球即使恢复 9—10 mph速度差仍持续产生差接触；先发与牛棚控制指标在校正对手后没有稳定差异；或健康评估显示增加变速球与负荷不合适。届时应回到动作、球种选择或长期角色分支重新分析。</w:t>
       </w:r>
     </w:p>
     <w:p>
@@ -1532,7 +3534,7 @@
           <w:color w:val="000000"/>
           <w:sz w:val="24"/>
         </w:rPr>
-        <w:t>今井仍拥有 MLB 级别的三振上限。正确的发展方向不是把高 ERA等同于球威不足，也不是因两场牛棚成功就永久改造成后援。短期应利用多局牛棚降低任务复杂度，恢复首球和好球区控制；中期把 2025 年已经成熟的变速球重新纳入对左打方案，修复与四缝线的速度分层；之后用预先声明的健康、控球、球种质量和负荷门槛重返先发。这个方案把“角色争论”转成可更新的决策流程，也明确哪些证据会推翻当前建议。</w:t>
+        <w:t>现有窗口内，今井的三振、挥空和四缝线均速未明显下降。正确方向既不是把高 ERA 直接等同于球威不足，也不是因两场牛棚改善就永久改造成后援。短期应利用多局牛棚降低任务复杂度，恢复首球和好球区控制；中期把 2025 年已经成熟的变速球重新纳入对左打方案，修复与四缝线的速度分层；之后用预先声明的健康、控球、球种质量和负荷门槛逐级返回先发。这样，角色争论被转化为可观察、可停止、可更新的决策流程。</w:t>
       </w:r>
     </w:p>
     <w:p>
@@ -1546,7 +3548,7 @@
           <w:color w:val="000000"/>
           <w:sz w:val="30"/>
         </w:rPr>
-        <w:t>12. 复现说明</w:t>
+        <w:t>12. 复现路径</w:t>
       </w:r>
     </w:p>
     <w:p>
@@ -1563,26 +3565,18 @@
           <w:color w:val="000000"/>
           <w:sz w:val="24"/>
         </w:rPr>
-        <w:t>运行顺序：</w:t>
+        <w:t>默认复现使用仓库内冻结快照，不访问网络：</w:t>
       </w:r>
-      <w:r>
-        <w:rPr>
-          <w:rFonts w:ascii="宋体" w:hAnsi="宋体" w:eastAsia="宋体" w:cs="宋体"/>
-          <w:b w:val="0"/>
-          <w:color w:val="000000"/>
-          <w:sz w:val="23"/>
-        </w:rPr>
-        <w:t>python scripts/fetch_data.py</w:t>
-      </w:r>
-      <w:r>
-        <w:rPr>
-          <w:rFonts w:ascii="宋体" w:hAnsi="宋体" w:eastAsia="宋体" w:cs="宋体"/>
-          <w:b w:val="0"/>
-          <w:color w:val="000000"/>
-          <w:sz w:val="24"/>
-        </w:rPr>
-        <w:t xml:space="preserve"> 获取并冻结原始数据；</w:t>
-      </w:r>
+    </w:p>
+    <w:p>
+      <w:pPr>
+        <w:numPr>
+          <w:ilvl w:val="0"/>
+          <w:numId w:val="16"/>
+        </w:numPr>
+        <w:spacing w:after="80" w:line="360" w:lineRule="auto"/>
+        <w:jc w:val="both"/>
+      </w:pPr>
       <w:r>
         <w:rPr>
           <w:rFonts w:ascii="宋体" w:hAnsi="宋体" w:eastAsia="宋体" w:cs="宋体"/>
@@ -1599,8 +3593,18 @@
           <w:color w:val="000000"/>
           <w:sz w:val="24"/>
         </w:rPr>
-        <w:t xml:space="preserve"> 生成处理表、校验与图表；</w:t>
+        <w:t>：读取 raw 快照，生成处理表、对账结果和两张诊断图。</w:t>
       </w:r>
+    </w:p>
+    <w:p>
+      <w:pPr>
+        <w:numPr>
+          <w:ilvl w:val="0"/>
+          <w:numId w:val="16"/>
+        </w:numPr>
+        <w:spacing w:after="80" w:line="360" w:lineRule="auto"/>
+        <w:jc w:val="both"/>
+      </w:pPr>
       <w:r>
         <w:rPr>
           <w:rFonts w:ascii="宋体" w:hAnsi="宋体" w:eastAsia="宋体" w:cs="宋体"/>
@@ -1617,7 +3621,80 @@
           <w:color w:val="000000"/>
           <w:sz w:val="24"/>
         </w:rPr>
-        <w:t xml:space="preserve"> 生成 Word 文稿。完整 URL 和哈希见 </w:t>
+        <w:t>：从两个 Markdown 单一文本源生成公开 DOCX。</w:t>
+      </w:r>
+    </w:p>
+    <w:p>
+      <w:pPr>
+        <w:numPr>
+          <w:ilvl w:val="0"/>
+          <w:numId w:val="16"/>
+        </w:numPr>
+        <w:spacing w:after="80" w:line="360" w:lineRule="auto"/>
+        <w:jc w:val="both"/>
+      </w:pPr>
+      <w:r>
+        <w:rPr>
+          <w:rFonts w:ascii="宋体" w:hAnsi="宋体" w:eastAsia="宋体" w:cs="宋体"/>
+          <w:b w:val="0"/>
+          <w:color w:val="000000"/>
+          <w:sz w:val="23"/>
+        </w:rPr>
+        <w:t>python scripts/verify_project.py</w:t>
+      </w:r>
+      <w:r>
+        <w:rPr>
+          <w:rFonts w:ascii="宋体" w:hAnsi="宋体" w:eastAsia="宋体" w:cs="宋体"/>
+          <w:b w:val="0"/>
+          <w:color w:val="000000"/>
+          <w:sz w:val="24"/>
+        </w:rPr>
+        <w:t>：验证 17 个来源哈希、四项对账、核心结论、文档结构和公开文件隐私扫描。</w:t>
+      </w:r>
+    </w:p>
+    <w:p>
+      <w:pPr>
+        <w:numPr>
+          <w:ilvl w:val="0"/>
+          <w:numId w:val="16"/>
+        </w:numPr>
+        <w:spacing w:after="80" w:line="360" w:lineRule="auto"/>
+        <w:jc w:val="both"/>
+      </w:pPr>
+      <w:r>
+        <w:rPr>
+          <w:rFonts w:ascii="宋体" w:hAnsi="宋体" w:eastAsia="宋体" w:cs="宋体"/>
+          <w:b w:val="0"/>
+          <w:color w:val="000000"/>
+          <w:sz w:val="23"/>
+        </w:rPr>
+        <w:t>python -m unittest discover -s tests -v</w:t>
+      </w:r>
+      <w:r>
+        <w:rPr>
+          <w:rFonts w:ascii="宋体" w:hAnsi="宋体" w:eastAsia="宋体" w:cs="宋体"/>
+          <w:b w:val="0"/>
+          <w:color w:val="000000"/>
+          <w:sz w:val="24"/>
+        </w:rPr>
+        <w:t>：运行离线单元测试与机制测试。</w:t>
+      </w:r>
+    </w:p>
+    <w:p>
+      <w:pPr>
+        <w:widowControl/>
+        <w:spacing w:after="80" w:line="360" w:lineRule="auto"/>
+        <w:ind w:firstLine="480"/>
+        <w:jc w:val="both"/>
+      </w:pPr>
+      <w:r>
+        <w:rPr>
+          <w:rFonts w:ascii="宋体" w:hAnsi="宋体" w:eastAsia="宋体" w:cs="宋体"/>
+          <w:b w:val="0"/>
+          <w:color w:val="000000"/>
+          <w:sz w:val="24"/>
+        </w:rPr>
+        <w:t>一键等价命令为</w:t>
       </w:r>
       <w:r>
         <w:rPr>
@@ -1626,7 +3703,7 @@
           <w:color w:val="000000"/>
           <w:sz w:val="23"/>
         </w:rPr>
-        <w:t>data/raw/source_manifest.csv</w:t>
+        <w:t>python scripts/run_pipeline.py</w:t>
       </w:r>
       <w:r>
         <w:rPr>
@@ -1635,7 +3712,7 @@
           <w:color w:val="000000"/>
           <w:sz w:val="24"/>
         </w:rPr>
-        <w:t xml:space="preserve">，对账见 </w:t>
+        <w:t>。只有建立新数据冻结点时才使用</w:t>
       </w:r>
       <w:r>
         <w:rPr>
@@ -1644,7 +3721,7 @@
           <w:color w:val="000000"/>
           <w:sz w:val="23"/>
         </w:rPr>
-        <w:t>qa/data_reconciliation.csv</w:t>
+        <w:t>python scripts/run_pipeline.py --refresh-data</w:t>
       </w:r>
       <w:r>
         <w:rPr>
@@ -1653,7 +3730,7 @@
           <w:color w:val="000000"/>
           <w:sz w:val="24"/>
         </w:rPr>
-        <w:t>。为保持历史可审计性，重新抓取会更新时间与动态来源哈希；纯复现分析时只运行后两个脚本。</w:t>
+        <w:t>；该操作会访问网络并替换 raw 快照，必须单独说明新截止日和变化。默认自动校验不声称完成视觉检查；DOCX 页数与版面需在渲染后逐页人工确认，再由单独的视觉记录进入严格门禁。</w:t>
       </w:r>
     </w:p>
     <w:p>
@@ -1674,7 +3751,7 @@
       <w:pPr>
         <w:numPr>
           <w:ilvl w:val="0"/>
-          <w:numId w:val="18"/>
+          <w:numId w:val="17"/>
         </w:numPr>
         <w:spacing w:after="80" w:line="360" w:lineRule="auto"/>
         <w:jc w:val="both"/>
@@ -1686,14 +3763,14 @@
           <w:color w:val="000000"/>
           <w:sz w:val="24"/>
         </w:rPr>
-        <w:t>MLB：17 场、15 次先发、64.2 局、80K、42BB、ERA 5.29、xERA 4.89、288 打席。</w:t>
+        <w:t>MLB：17 场、15 次先发、194 个出局数、80K、42BB、ERA 5.29、xERA 4.89、288 打席。</w:t>
       </w:r>
     </w:p>
     <w:p>
       <w:pPr>
         <w:numPr>
           <w:ilvl w:val="0"/>
-          <w:numId w:val="18"/>
+          <w:numId w:val="17"/>
         </w:numPr>
         <w:spacing w:after="80" w:line="360" w:lineRule="auto"/>
         <w:jc w:val="both"/>
@@ -1705,14 +3782,14 @@
           <w:color w:val="000000"/>
           <w:sz w:val="24"/>
         </w:rPr>
-        <w:t>NPB 2025：163.2 局、178K、45BB、ERA 1.92、K% 27.8、BB% 7.0、FIP 2.351。</w:t>
+        <w:t>NPB 2025：163⅔ 局、178K、45BB、ERA 1.92、K% 27.8%、BB% 7.0%、FIP 2.351。</w:t>
       </w:r>
     </w:p>
     <w:p>
       <w:pPr>
         <w:numPr>
           <w:ilvl w:val="0"/>
-          <w:numId w:val="18"/>
+          <w:numId w:val="17"/>
         </w:numPr>
         <w:spacing w:after="80" w:line="360" w:lineRule="auto"/>
         <w:jc w:val="both"/>
@@ -1724,14 +3801,14 @@
           <w:color w:val="000000"/>
           <w:sz w:val="24"/>
         </w:rPr>
-        <w:t>MLB 过程：Zone 43.6、首球好球 51.7、Whiff 32.3、Chase 27.2、K-BB 13.2。</w:t>
+        <w:t>MLB 过程：Zone% 43.6%、首球好球率 51.7%、Whiff 32.3%、Chase 27.2%、K-BB% 13.2%。</w:t>
       </w:r>
     </w:p>
     <w:p>
       <w:pPr>
         <w:numPr>
           <w:ilvl w:val="0"/>
-          <w:numId w:val="18"/>
+          <w:numId w:val="17"/>
         </w:numPr>
         <w:spacing w:after="80" w:line="360" w:lineRule="auto"/>
         <w:jc w:val="both"/>
@@ -1743,14 +3820,14 @@
           <w:color w:val="000000"/>
           <w:sz w:val="24"/>
         </w:rPr>
-        <w:t>球种：滑球 45.3%/+4 RV；四缝线 43.5%/-1 RV；变速球 2.3%/-1 RV（仅 29 球）。</w:t>
+        <w:t>球种：滑球 45.3%/+4 RV；四缝线 43.5%/−1 RV；变速球 2.3%/−1 RV（仅 29 球）。</w:t>
       </w:r>
     </w:p>
     <w:p>
       <w:pPr>
         <w:numPr>
           <w:ilvl w:val="0"/>
-          <w:numId w:val="18"/>
+          <w:numId w:val="17"/>
         </w:numPr>
         <w:spacing w:after="80" w:line="360" w:lineRule="auto"/>
         <w:jc w:val="both"/>
@@ -1762,14 +3839,14 @@
           <w:color w:val="000000"/>
           <w:sz w:val="24"/>
         </w:rPr>
-        <w:t>NPB 2025 变速球：12.7%、84.7 mph、41.6% Whiff、xPV/100 +1.03。</w:t>
+        <w:t>NPB 2025 变速球：12.7%、84.73 mph、41.6% Whiff、xPV/100 +1.03。</w:t>
       </w:r>
     </w:p>
     <w:p>
       <w:pPr>
         <w:numPr>
           <w:ilvl w:val="0"/>
-          <w:numId w:val="18"/>
+          <w:numId w:val="17"/>
         </w:numPr>
         <w:spacing w:after="80" w:line="360" w:lineRule="auto"/>
         <w:jc w:val="both"/>
@@ -1781,14 +3858,14 @@
           <w:color w:val="000000"/>
           <w:sz w:val="24"/>
         </w:rPr>
-        <w:t>对左打四缝线：311 球、15.4% Whiff、RV/100 -1.27。</w:t>
+        <w:t>对左打四缝线：311 球、15.4% Whiff、RV/100 −1.27。</w:t>
       </w:r>
     </w:p>
     <w:p>
       <w:pPr>
         <w:numPr>
           <w:ilvl w:val="0"/>
-          <w:numId w:val="18"/>
+          <w:numId w:val="17"/>
         </w:numPr>
         <w:spacing w:after="80" w:line="360" w:lineRule="auto"/>
         <w:jc w:val="both"/>
@@ -1800,7 +3877,7 @@
           <w:color w:val="000000"/>
           <w:sz w:val="24"/>
         </w:rPr>
-        <w:t>牛棚：89 球、23 打席；Zone 46.1、首球好球 73.9、Whiff 40.0。</w:t>
+        <w:t>牛棚：89 球、23 打席；Zone% 46.1%、首球好球率 73.9%、Whiff 40.0%。</w:t>
       </w:r>
     </w:p>
     <w:p>
@@ -1831,7 +3908,7 @@
           <w:color w:val="000000"/>
           <w:sz w:val="24"/>
         </w:rPr>
-        <w:t xml:space="preserve">AI 用于读取课程要求、检索公开数据、编写抓取与分析代码、迭代假设、生成图表和起草文稿。每一步摘要记录在 </w:t>
+        <w:t>AI 工具参与了课程要求提取、公开数据抓取、代码与图表生成、假设迭代和文稿初稿整理；执行摘要记录在</w:t>
       </w:r>
       <w:r>
         <w:rPr>
@@ -1849,7 +3926,7 @@
           <w:color w:val="000000"/>
           <w:sz w:val="24"/>
         </w:rPr>
-        <w:t xml:space="preserve">；假设变化记录在 </w:t>
+        <w:t>，假设变化记录在</w:t>
       </w:r>
       <w:r>
         <w:rPr>
@@ -1867,74 +3944,7 @@
           <w:color w:val="000000"/>
           <w:sz w:val="24"/>
         </w:rPr>
-        <w:t>。关键结论必须能由保存的数据和脚本重算。没有获得的数据不补写；低样本结果明确标记；观察性角色比较不表述为因果。</w:t>
-      </w:r>
-    </w:p>
-    <w:p>
-      <w:pPr>
-        <w:pStyle w:val="Heading1"/>
-      </w:pPr>
-      <w:r>
-        <w:rPr>
-          <w:rFonts w:ascii="黑体" w:hAnsi="黑体" w:eastAsia="黑体" w:cs="黑体"/>
-          <w:b/>
-          <w:color w:val="000000"/>
-          <w:sz w:val="30"/>
-        </w:rPr>
-        <w:t>附录 C：来源</w:t>
-      </w:r>
-    </w:p>
-    <w:p>
-      <w:pPr>
-        <w:widowControl/>
-        <w:spacing w:after="80" w:line="360" w:lineRule="auto"/>
-        <w:ind w:firstLine="480"/>
-        <w:jc w:val="both"/>
-      </w:pPr>
-      <w:r>
-        <w:rPr>
-          <w:rFonts w:ascii="宋体" w:hAnsi="宋体" w:eastAsia="宋体" w:cs="宋体"/>
-          <w:b w:val="0"/>
-          <w:color w:val="000000"/>
-          <w:sz w:val="24"/>
-        </w:rPr>
-        <w:t xml:space="preserve">S1 MLB StatsAPI；S2 Baseball Savant Statcast Search；S3 Savant Expected Statistics；S4 Savant Pitch Arsenal；S5 NPB 官方球员页；S6 NPB Basement；S7 MLB.com 2026-05-31；S8 MLB.com 2026-07-31。完整 URL、本地文件名、下载时间和 SHA-256 见 </w:t>
-      </w:r>
-      <w:r>
-        <w:rPr>
-          <w:rFonts w:ascii="宋体" w:hAnsi="宋体" w:eastAsia="宋体" w:cs="宋体"/>
-          <w:b w:val="0"/>
-          <w:color w:val="000000"/>
-          <w:sz w:val="23"/>
-        </w:rPr>
-        <w:t>docs/research/source_register.md</w:t>
-      </w:r>
-      <w:r>
-        <w:rPr>
-          <w:rFonts w:ascii="宋体" w:hAnsi="宋体" w:eastAsia="宋体" w:cs="宋体"/>
-          <w:b w:val="0"/>
-          <w:color w:val="000000"/>
-          <w:sz w:val="24"/>
-        </w:rPr>
-        <w:t xml:space="preserve"> 与 </w:t>
-      </w:r>
-      <w:r>
-        <w:rPr>
-          <w:rFonts w:ascii="宋体" w:hAnsi="宋体" w:eastAsia="宋体" w:cs="宋体"/>
-          <w:b w:val="0"/>
-          <w:color w:val="000000"/>
-          <w:sz w:val="23"/>
-        </w:rPr>
-        <w:t>data/raw/source_manifest.csv</w:t>
-      </w:r>
-      <w:r>
-        <w:rPr>
-          <w:rFonts w:ascii="宋体" w:hAnsi="宋体" w:eastAsia="宋体" w:cs="宋体"/>
-          <w:b w:val="0"/>
-          <w:color w:val="000000"/>
-          <w:sz w:val="24"/>
-        </w:rPr>
-        <w:t>。</w:t>
+        <w:t>。可复现性约束是：关键数字必须能由已保存数据和脚本重算；没有取得的数据不补写；小样本与观察性比较明确标注；自动校验不冒充人工视觉审查。提交者仍需核对结论、口径和最终版式，并对交付内容负责。</w:t>
       </w:r>
     </w:p>
     <w:sectPr>
@@ -2278,8 +4288,8 @@
     <w:multiLevelType w:val="singleLevel"/>
     <w:lvl w:ilvl="0">
       <w:start w:val="1"/>
-      <w:numFmt w:val="bullet"/>
-      <w:lvlText w:val="•"/>
+      <w:numFmt w:val="decimal"/>
+      <w:lvlText w:val="%1."/>
       <w:suff w:val="space"/>
       <w:pPr>
         <w:tabs>
@@ -2296,8 +4306,8 @@
     <w:multiLevelType w:val="singleLevel"/>
     <w:lvl w:ilvl="0">
       <w:start w:val="1"/>
-      <w:numFmt w:val="bullet"/>
-      <w:lvlText w:val="•"/>
+      <w:numFmt w:val="decimal"/>
+      <w:lvlText w:val="%1."/>
       <w:suff w:val="space"/>
       <w:pPr>
         <w:tabs>
@@ -2314,8 +4324,8 @@
     <w:multiLevelType w:val="singleLevel"/>
     <w:lvl w:ilvl="0">
       <w:start w:val="1"/>
-      <w:numFmt w:val="decimal"/>
-      <w:lvlText w:val="%1."/>
+      <w:numFmt w:val="bullet"/>
+      <w:lvlText w:val="•"/>
       <w:suff w:val="space"/>
       <w:pPr>
         <w:tabs>
@@ -2327,24 +4337,6 @@
   </w:abstractNum>
   <w:num w:numId="17">
     <w:abstractNumId w:val="16"/>
-  </w:num>
-  <w:abstractNum w:abstractNumId="17">
-    <w:multiLevelType w:val="singleLevel"/>
-    <w:lvl w:ilvl="0">
-      <w:start w:val="1"/>
-      <w:numFmt w:val="bullet"/>
-      <w:lvlText w:val="•"/>
-      <w:suff w:val="space"/>
-      <w:pPr>
-        <w:tabs>
-          <w:tab w:val="num" w:pos="720"/>
-        </w:tabs>
-        <w:ind w:left="720" w:hanging="360"/>
-      </w:pPr>
-    </w:lvl>
-  </w:abstractNum>
-  <w:num w:numId="18">
-    <w:abstractNumId w:val="17"/>
   </w:num>
 </w:numbering>
 </file>

</xml_diff>